<commit_message>
Add detailed cash-flow schedule to the business plan (S 9.7)
Add monthly test-phase cash flow, a full 12-month Year-1 base-rollout operating
cash flow (revenue/cost lines, net, cumulative; peak burn ~$409K, cash-positive
by M12), a Years 2-3 quarterly cash flow (quarter-positive in Y3 Q3), and a
consolidated test+3-year funding/crossover schedule (peak cumulative PoC capital
~$1.1M within the Ventures ~$3.0M envelope). Regenerated Word export.

Co-Authored-By: Claude Opus 4.8 (1M context) <noreply@anthropic.com>
Claude-Session: https://claude.ai/code/session_016gWMtWeutWcnpqhZxT7WHC
</commit_message>
<xml_diff>
--- a/PoC-Business-Plan.docx
+++ b/PoC-Business-Plan.docx
@@ -9196,6 +9196,4053 @@
       </w:pPr>
       <w:r>
         <w:t>Base case shares the platform with Pet Intelligence (synergy savings ~$150–450K/yr at the Ventures level).</w:t>
+      </w:r>
+    </w:p>
+    <w:p>
+      <w:pPr>
+        <w:pStyle w:val="Heading3"/>
+      </w:pPr>
+      <w:r>
+        <w:rPr>
+          <w:color w:val="2E5496"/>
+        </w:rPr>
+        <w:t>9.7 Detailed cash-flow schedule</w:t>
+      </w:r>
+    </w:p>
+    <w:p>
+      <w:r>
+        <w:t>All figures $000. PoC standalone (pre-royalty); capital draws shown are PoC's share within APPA Ventures' staged ~$3.0M ($1.6M / $1.0M / $0.35M), which also funds Pet Intelligence.</w:t>
+      </w:r>
+    </w:p>
+    <w:p>
+      <w:r>
+        <w:rPr>
+          <w:b/>
+        </w:rPr>
+        <w:t>(a) Test phase — monthly (Months 1–5, ~$200K, no entity).</w:t>
+      </w:r>
+      <w:r>
+        <w:t xml:space="preserve"> Revenue treated as ~$0 (monetization tests are signal, not material cash).</w:t>
+      </w:r>
+    </w:p>
+    <w:tbl>
+      <w:tblPr>
+        <w:tblStyle w:val="TableGrid"/>
+        <w:tblW w:type="auto" w:w="0"/>
+        <w:tblLayout w:type="autofit"/>
+        <w:tblLook w:firstColumn="1" w:firstRow="1" w:lastColumn="0" w:lastRow="0" w:noHBand="0" w:noVBand="1" w:val="04A0"/>
+      </w:tblPr>
+      <w:tblGrid>
+        <w:gridCol w:w="2880"/>
+        <w:gridCol w:w="2880"/>
+        <w:gridCol w:w="2880"/>
+      </w:tblGrid>
+      <w:tr>
+        <w:tc>
+          <w:tcPr>
+            <w:tcW w:type="dxa" w:w="2880"/>
+            <w:shd w:val="clear" w:fill="DBE5F1"/>
+          </w:tcPr>
+          <w:p>
+            <w:r>
+              <w:rPr>
+                <w:b/>
+                <w:sz w:val="20"/>
+              </w:rPr>
+            </w:r>
+            <w:r>
+              <w:rPr>
+                <w:b/>
+                <w:sz w:val="20"/>
+              </w:rPr>
+              <w:t>Month</w:t>
+            </w:r>
+          </w:p>
+        </w:tc>
+        <w:tc>
+          <w:tcPr>
+            <w:tcW w:type="dxa" w:w="2880"/>
+            <w:shd w:val="clear" w:fill="DBE5F1"/>
+          </w:tcPr>
+          <w:p>
+            <w:r>
+              <w:rPr>
+                <w:b/>
+                <w:sz w:val="20"/>
+              </w:rPr>
+            </w:r>
+            <w:r>
+              <w:rPr>
+                <w:b/>
+                <w:sz w:val="20"/>
+              </w:rPr>
+              <w:t>Cash outflow</w:t>
+            </w:r>
+          </w:p>
+        </w:tc>
+        <w:tc>
+          <w:tcPr>
+            <w:tcW w:type="dxa" w:w="2880"/>
+            <w:shd w:val="clear" w:fill="DBE5F1"/>
+          </w:tcPr>
+          <w:p>
+            <w:r>
+              <w:rPr>
+                <w:b/>
+                <w:sz w:val="20"/>
+              </w:rPr>
+            </w:r>
+            <w:r>
+              <w:rPr>
+                <w:b/>
+                <w:sz w:val="20"/>
+              </w:rPr>
+              <w:t>Cumulative</w:t>
+            </w:r>
+          </w:p>
+        </w:tc>
+      </w:tr>
+      <w:tr>
+        <w:tc>
+          <w:tcPr>
+            <w:tcW w:type="dxa" w:w="2880"/>
+          </w:tcPr>
+          <w:p>
+            <w:r>
+              <w:rPr>
+                <w:sz w:val="20"/>
+              </w:rPr>
+            </w:r>
+            <w:r>
+              <w:rPr>
+                <w:sz w:val="20"/>
+              </w:rPr>
+              <w:t>M1</w:t>
+            </w:r>
+          </w:p>
+        </w:tc>
+        <w:tc>
+          <w:tcPr>
+            <w:tcW w:type="dxa" w:w="2880"/>
+          </w:tcPr>
+          <w:p>
+            <w:r>
+              <w:rPr>
+                <w:sz w:val="20"/>
+              </w:rPr>
+            </w:r>
+            <w:r>
+              <w:rPr>
+                <w:sz w:val="20"/>
+              </w:rPr>
+              <w:t>34</w:t>
+            </w:r>
+          </w:p>
+        </w:tc>
+        <w:tc>
+          <w:tcPr>
+            <w:tcW w:type="dxa" w:w="2880"/>
+          </w:tcPr>
+          <w:p>
+            <w:r>
+              <w:rPr>
+                <w:sz w:val="20"/>
+              </w:rPr>
+            </w:r>
+            <w:r>
+              <w:rPr>
+                <w:sz w:val="20"/>
+              </w:rPr>
+              <w:t>(34)</w:t>
+            </w:r>
+          </w:p>
+        </w:tc>
+      </w:tr>
+      <w:tr>
+        <w:tc>
+          <w:tcPr>
+            <w:tcW w:type="dxa" w:w="2880"/>
+          </w:tcPr>
+          <w:p>
+            <w:r>
+              <w:rPr>
+                <w:sz w:val="20"/>
+              </w:rPr>
+            </w:r>
+            <w:r>
+              <w:rPr>
+                <w:sz w:val="20"/>
+              </w:rPr>
+              <w:t>M2</w:t>
+            </w:r>
+          </w:p>
+        </w:tc>
+        <w:tc>
+          <w:tcPr>
+            <w:tcW w:type="dxa" w:w="2880"/>
+          </w:tcPr>
+          <w:p>
+            <w:r>
+              <w:rPr>
+                <w:sz w:val="20"/>
+              </w:rPr>
+            </w:r>
+            <w:r>
+              <w:rPr>
+                <w:sz w:val="20"/>
+              </w:rPr>
+              <w:t>39</w:t>
+            </w:r>
+          </w:p>
+        </w:tc>
+        <w:tc>
+          <w:tcPr>
+            <w:tcW w:type="dxa" w:w="2880"/>
+          </w:tcPr>
+          <w:p>
+            <w:r>
+              <w:rPr>
+                <w:sz w:val="20"/>
+              </w:rPr>
+            </w:r>
+            <w:r>
+              <w:rPr>
+                <w:sz w:val="20"/>
+              </w:rPr>
+              <w:t>(73)</w:t>
+            </w:r>
+          </w:p>
+        </w:tc>
+      </w:tr>
+      <w:tr>
+        <w:tc>
+          <w:tcPr>
+            <w:tcW w:type="dxa" w:w="2880"/>
+          </w:tcPr>
+          <w:p>
+            <w:r>
+              <w:rPr>
+                <w:sz w:val="20"/>
+              </w:rPr>
+            </w:r>
+            <w:r>
+              <w:rPr>
+                <w:sz w:val="20"/>
+              </w:rPr>
+              <w:t>M3</w:t>
+            </w:r>
+          </w:p>
+        </w:tc>
+        <w:tc>
+          <w:tcPr>
+            <w:tcW w:type="dxa" w:w="2880"/>
+          </w:tcPr>
+          <w:p>
+            <w:r>
+              <w:rPr>
+                <w:sz w:val="20"/>
+              </w:rPr>
+            </w:r>
+            <w:r>
+              <w:rPr>
+                <w:sz w:val="20"/>
+              </w:rPr>
+              <w:t>38</w:t>
+            </w:r>
+          </w:p>
+        </w:tc>
+        <w:tc>
+          <w:tcPr>
+            <w:tcW w:type="dxa" w:w="2880"/>
+          </w:tcPr>
+          <w:p>
+            <w:r>
+              <w:rPr>
+                <w:sz w:val="20"/>
+              </w:rPr>
+            </w:r>
+            <w:r>
+              <w:rPr>
+                <w:sz w:val="20"/>
+              </w:rPr>
+              <w:t>(111)</w:t>
+            </w:r>
+          </w:p>
+        </w:tc>
+      </w:tr>
+      <w:tr>
+        <w:tc>
+          <w:tcPr>
+            <w:tcW w:type="dxa" w:w="2880"/>
+          </w:tcPr>
+          <w:p>
+            <w:r>
+              <w:rPr>
+                <w:sz w:val="20"/>
+              </w:rPr>
+            </w:r>
+            <w:r>
+              <w:rPr>
+                <w:sz w:val="20"/>
+              </w:rPr>
+              <w:t>M4</w:t>
+            </w:r>
+          </w:p>
+        </w:tc>
+        <w:tc>
+          <w:tcPr>
+            <w:tcW w:type="dxa" w:w="2880"/>
+          </w:tcPr>
+          <w:p>
+            <w:r>
+              <w:rPr>
+                <w:sz w:val="20"/>
+              </w:rPr>
+            </w:r>
+            <w:r>
+              <w:rPr>
+                <w:sz w:val="20"/>
+              </w:rPr>
+              <w:t>45</w:t>
+            </w:r>
+          </w:p>
+        </w:tc>
+        <w:tc>
+          <w:tcPr>
+            <w:tcW w:type="dxa" w:w="2880"/>
+          </w:tcPr>
+          <w:p>
+            <w:r>
+              <w:rPr>
+                <w:sz w:val="20"/>
+              </w:rPr>
+            </w:r>
+            <w:r>
+              <w:rPr>
+                <w:sz w:val="20"/>
+              </w:rPr>
+              <w:t>(156)</w:t>
+            </w:r>
+          </w:p>
+        </w:tc>
+      </w:tr>
+      <w:tr>
+        <w:tc>
+          <w:tcPr>
+            <w:tcW w:type="dxa" w:w="2880"/>
+          </w:tcPr>
+          <w:p>
+            <w:r>
+              <w:rPr>
+                <w:sz w:val="20"/>
+              </w:rPr>
+            </w:r>
+            <w:r>
+              <w:rPr>
+                <w:sz w:val="20"/>
+              </w:rPr>
+              <w:t>M5</w:t>
+            </w:r>
+          </w:p>
+        </w:tc>
+        <w:tc>
+          <w:tcPr>
+            <w:tcW w:type="dxa" w:w="2880"/>
+          </w:tcPr>
+          <w:p>
+            <w:r>
+              <w:rPr>
+                <w:sz w:val="20"/>
+              </w:rPr>
+            </w:r>
+            <w:r>
+              <w:rPr>
+                <w:sz w:val="20"/>
+              </w:rPr>
+              <w:t>44</w:t>
+            </w:r>
+          </w:p>
+        </w:tc>
+        <w:tc>
+          <w:tcPr>
+            <w:tcW w:type="dxa" w:w="2880"/>
+          </w:tcPr>
+          <w:p>
+            <w:r>
+              <w:rPr>
+                <w:sz w:val="20"/>
+              </w:rPr>
+            </w:r>
+            <w:r>
+              <w:rPr>
+                <w:sz w:val="20"/>
+              </w:rPr>
+              <w:t>(200)</w:t>
+            </w:r>
+          </w:p>
+        </w:tc>
+      </w:tr>
+    </w:tbl>
+    <w:p>
+      <w:r>
+        <w:t xml:space="preserve">Peak test-phase cash need = </w:t>
+      </w:r>
+      <w:r>
+        <w:rPr>
+          <w:b/>
+        </w:rPr>
+        <w:t>$200K</w:t>
+      </w:r>
+      <w:r>
+        <w:t>, funded by an APPA operating-budget line.</w:t>
+      </w:r>
+    </w:p>
+    <w:p>
+      <w:r>
+        <w:rPr>
+          <w:b/>
+        </w:rPr>
+        <w:t>(b) Year 1 base rollout — monthly operating cash flow</w:t>
+      </w:r>
+      <w:r>
+        <w:t xml:space="preserve"> (post-incorporation). Revenue ramps as markets launch and graduate; central platform is front-loaded for setup; net turns cash-positive in M12.</w:t>
+      </w:r>
+    </w:p>
+    <w:tbl>
+      <w:tblPr>
+        <w:tblStyle w:val="TableGrid"/>
+        <w:tblW w:type="auto" w:w="0"/>
+        <w:tblLayout w:type="autofit"/>
+        <w:tblLook w:firstColumn="1" w:firstRow="1" w:lastColumn="0" w:lastRow="0" w:noHBand="0" w:noVBand="1" w:val="04A0"/>
+      </w:tblPr>
+      <w:tblGrid>
+        <w:gridCol w:w="1080"/>
+        <w:gridCol w:w="1080"/>
+        <w:gridCol w:w="1080"/>
+        <w:gridCol w:w="1080"/>
+        <w:gridCol w:w="1080"/>
+        <w:gridCol w:w="1080"/>
+        <w:gridCol w:w="1080"/>
+        <w:gridCol w:w="1080"/>
+      </w:tblGrid>
+      <w:tr>
+        <w:tc>
+          <w:tcPr>
+            <w:tcW w:type="dxa" w:w="1080"/>
+            <w:shd w:val="clear" w:fill="DBE5F1"/>
+          </w:tcPr>
+          <w:p>
+            <w:r>
+              <w:rPr>
+                <w:b/>
+                <w:sz w:val="20"/>
+              </w:rPr>
+            </w:r>
+            <w:r>
+              <w:rPr>
+                <w:b/>
+                <w:sz w:val="20"/>
+              </w:rPr>
+              <w:t>Month</w:t>
+            </w:r>
+          </w:p>
+        </w:tc>
+        <w:tc>
+          <w:tcPr>
+            <w:tcW w:type="dxa" w:w="1080"/>
+            <w:shd w:val="clear" w:fill="DBE5F1"/>
+          </w:tcPr>
+          <w:p>
+            <w:r>
+              <w:rPr>
+                <w:b/>
+                <w:sz w:val="20"/>
+              </w:rPr>
+            </w:r>
+            <w:r>
+              <w:rPr>
+                <w:b/>
+                <w:sz w:val="20"/>
+              </w:rPr>
+              <w:t>Revenue</w:t>
+            </w:r>
+          </w:p>
+        </w:tc>
+        <w:tc>
+          <w:tcPr>
+            <w:tcW w:type="dxa" w:w="1080"/>
+            <w:shd w:val="clear" w:fill="DBE5F1"/>
+          </w:tcPr>
+          <w:p>
+            <w:r>
+              <w:rPr>
+                <w:b/>
+                <w:sz w:val="20"/>
+              </w:rPr>
+            </w:r>
+            <w:r>
+              <w:rPr>
+                <w:b/>
+                <w:sz w:val="20"/>
+              </w:rPr>
+              <w:t>Editor &amp; local</w:t>
+            </w:r>
+          </w:p>
+        </w:tc>
+        <w:tc>
+          <w:tcPr>
+            <w:tcW w:type="dxa" w:w="1080"/>
+            <w:shd w:val="clear" w:fill="DBE5F1"/>
+          </w:tcPr>
+          <w:p>
+            <w:r>
+              <w:rPr>
+                <w:b/>
+                <w:sz w:val="20"/>
+              </w:rPr>
+            </w:r>
+            <w:r>
+              <w:rPr>
+                <w:b/>
+                <w:sz w:val="20"/>
+              </w:rPr>
+              <w:t>Central platform</w:t>
+            </w:r>
+          </w:p>
+        </w:tc>
+        <w:tc>
+          <w:tcPr>
+            <w:tcW w:type="dxa" w:w="1080"/>
+            <w:shd w:val="clear" w:fill="DBE5F1"/>
+          </w:tcPr>
+          <w:p>
+            <w:r>
+              <w:rPr>
+                <w:b/>
+                <w:sz w:val="20"/>
+              </w:rPr>
+            </w:r>
+            <w:r>
+              <w:rPr>
+                <w:b/>
+                <w:sz w:val="20"/>
+              </w:rPr>
+              <w:t>Acquisition</w:t>
+            </w:r>
+          </w:p>
+        </w:tc>
+        <w:tc>
+          <w:tcPr>
+            <w:tcW w:type="dxa" w:w="1080"/>
+            <w:shd w:val="clear" w:fill="DBE5F1"/>
+          </w:tcPr>
+          <w:p>
+            <w:r>
+              <w:rPr>
+                <w:b/>
+                <w:sz w:val="20"/>
+              </w:rPr>
+            </w:r>
+            <w:r>
+              <w:rPr>
+                <w:b/>
+                <w:sz w:val="20"/>
+              </w:rPr>
+              <w:t>Total cost</w:t>
+            </w:r>
+          </w:p>
+        </w:tc>
+        <w:tc>
+          <w:tcPr>
+            <w:tcW w:type="dxa" w:w="1080"/>
+            <w:shd w:val="clear" w:fill="DBE5F1"/>
+          </w:tcPr>
+          <w:p>
+            <w:r>
+              <w:rPr>
+                <w:b/>
+                <w:sz w:val="20"/>
+              </w:rPr>
+            </w:r>
+            <w:r>
+              <w:rPr>
+                <w:b/>
+                <w:sz w:val="20"/>
+              </w:rPr>
+              <w:t>Net CF</w:t>
+            </w:r>
+          </w:p>
+        </w:tc>
+        <w:tc>
+          <w:tcPr>
+            <w:tcW w:type="dxa" w:w="1080"/>
+            <w:shd w:val="clear" w:fill="DBE5F1"/>
+          </w:tcPr>
+          <w:p>
+            <w:r>
+              <w:rPr>
+                <w:b/>
+                <w:sz w:val="20"/>
+              </w:rPr>
+            </w:r>
+            <w:r>
+              <w:rPr>
+                <w:b/>
+                <w:sz w:val="20"/>
+              </w:rPr>
+              <w:t>Cumulative</w:t>
+            </w:r>
+          </w:p>
+        </w:tc>
+      </w:tr>
+      <w:tr>
+        <w:tc>
+          <w:tcPr>
+            <w:tcW w:type="dxa" w:w="1080"/>
+          </w:tcPr>
+          <w:p>
+            <w:r>
+              <w:rPr>
+                <w:sz w:val="20"/>
+              </w:rPr>
+            </w:r>
+            <w:r>
+              <w:rPr>
+                <w:sz w:val="20"/>
+              </w:rPr>
+              <w:t>M1</w:t>
+            </w:r>
+          </w:p>
+        </w:tc>
+        <w:tc>
+          <w:tcPr>
+            <w:tcW w:type="dxa" w:w="1080"/>
+          </w:tcPr>
+          <w:p>
+            <w:r>
+              <w:rPr>
+                <w:sz w:val="20"/>
+              </w:rPr>
+            </w:r>
+            <w:r>
+              <w:rPr>
+                <w:sz w:val="20"/>
+              </w:rPr>
+              <w:t>5</w:t>
+            </w:r>
+          </w:p>
+        </w:tc>
+        <w:tc>
+          <w:tcPr>
+            <w:tcW w:type="dxa" w:w="1080"/>
+          </w:tcPr>
+          <w:p>
+            <w:r>
+              <w:rPr>
+                <w:sz w:val="20"/>
+              </w:rPr>
+            </w:r>
+            <w:r>
+              <w:rPr>
+                <w:sz w:val="20"/>
+              </w:rPr>
+              <w:t>8</w:t>
+            </w:r>
+          </w:p>
+        </w:tc>
+        <w:tc>
+          <w:tcPr>
+            <w:tcW w:type="dxa" w:w="1080"/>
+          </w:tcPr>
+          <w:p>
+            <w:r>
+              <w:rPr>
+                <w:sz w:val="20"/>
+              </w:rPr>
+            </w:r>
+            <w:r>
+              <w:rPr>
+                <w:sz w:val="20"/>
+              </w:rPr>
+              <w:t>45</w:t>
+            </w:r>
+          </w:p>
+        </w:tc>
+        <w:tc>
+          <w:tcPr>
+            <w:tcW w:type="dxa" w:w="1080"/>
+          </w:tcPr>
+          <w:p>
+            <w:r>
+              <w:rPr>
+                <w:sz w:val="20"/>
+              </w:rPr>
+            </w:r>
+            <w:r>
+              <w:rPr>
+                <w:sz w:val="20"/>
+              </w:rPr>
+              <w:t>10</w:t>
+            </w:r>
+          </w:p>
+        </w:tc>
+        <w:tc>
+          <w:tcPr>
+            <w:tcW w:type="dxa" w:w="1080"/>
+          </w:tcPr>
+          <w:p>
+            <w:r>
+              <w:rPr>
+                <w:sz w:val="20"/>
+              </w:rPr>
+            </w:r>
+            <w:r>
+              <w:rPr>
+                <w:sz w:val="20"/>
+              </w:rPr>
+              <w:t>63</w:t>
+            </w:r>
+          </w:p>
+        </w:tc>
+        <w:tc>
+          <w:tcPr>
+            <w:tcW w:type="dxa" w:w="1080"/>
+          </w:tcPr>
+          <w:p>
+            <w:r>
+              <w:rPr>
+                <w:sz w:val="20"/>
+              </w:rPr>
+            </w:r>
+            <w:r>
+              <w:rPr>
+                <w:sz w:val="20"/>
+              </w:rPr>
+              <w:t>(58)</w:t>
+            </w:r>
+          </w:p>
+        </w:tc>
+        <w:tc>
+          <w:tcPr>
+            <w:tcW w:type="dxa" w:w="1080"/>
+          </w:tcPr>
+          <w:p>
+            <w:r>
+              <w:rPr>
+                <w:sz w:val="20"/>
+              </w:rPr>
+            </w:r>
+            <w:r>
+              <w:rPr>
+                <w:sz w:val="20"/>
+              </w:rPr>
+              <w:t>(58)</w:t>
+            </w:r>
+          </w:p>
+        </w:tc>
+      </w:tr>
+      <w:tr>
+        <w:tc>
+          <w:tcPr>
+            <w:tcW w:type="dxa" w:w="1080"/>
+          </w:tcPr>
+          <w:p>
+            <w:r>
+              <w:rPr>
+                <w:sz w:val="20"/>
+              </w:rPr>
+            </w:r>
+            <w:r>
+              <w:rPr>
+                <w:sz w:val="20"/>
+              </w:rPr>
+              <w:t>M2</w:t>
+            </w:r>
+          </w:p>
+        </w:tc>
+        <w:tc>
+          <w:tcPr>
+            <w:tcW w:type="dxa" w:w="1080"/>
+          </w:tcPr>
+          <w:p>
+            <w:r>
+              <w:rPr>
+                <w:sz w:val="20"/>
+              </w:rPr>
+            </w:r>
+            <w:r>
+              <w:rPr>
+                <w:sz w:val="20"/>
+              </w:rPr>
+              <w:t>8</w:t>
+            </w:r>
+          </w:p>
+        </w:tc>
+        <w:tc>
+          <w:tcPr>
+            <w:tcW w:type="dxa" w:w="1080"/>
+          </w:tcPr>
+          <w:p>
+            <w:r>
+              <w:rPr>
+                <w:sz w:val="20"/>
+              </w:rPr>
+            </w:r>
+            <w:r>
+              <w:rPr>
+                <w:sz w:val="20"/>
+              </w:rPr>
+              <w:t>8</w:t>
+            </w:r>
+          </w:p>
+        </w:tc>
+        <w:tc>
+          <w:tcPr>
+            <w:tcW w:type="dxa" w:w="1080"/>
+          </w:tcPr>
+          <w:p>
+            <w:r>
+              <w:rPr>
+                <w:sz w:val="20"/>
+              </w:rPr>
+            </w:r>
+            <w:r>
+              <w:rPr>
+                <w:sz w:val="20"/>
+              </w:rPr>
+              <w:t>42</w:t>
+            </w:r>
+          </w:p>
+        </w:tc>
+        <w:tc>
+          <w:tcPr>
+            <w:tcW w:type="dxa" w:w="1080"/>
+          </w:tcPr>
+          <w:p>
+            <w:r>
+              <w:rPr>
+                <w:sz w:val="20"/>
+              </w:rPr>
+            </w:r>
+            <w:r>
+              <w:rPr>
+                <w:sz w:val="20"/>
+              </w:rPr>
+              <w:t>12</w:t>
+            </w:r>
+          </w:p>
+        </w:tc>
+        <w:tc>
+          <w:tcPr>
+            <w:tcW w:type="dxa" w:w="1080"/>
+          </w:tcPr>
+          <w:p>
+            <w:r>
+              <w:rPr>
+                <w:sz w:val="20"/>
+              </w:rPr>
+            </w:r>
+            <w:r>
+              <w:rPr>
+                <w:sz w:val="20"/>
+              </w:rPr>
+              <w:t>62</w:t>
+            </w:r>
+          </w:p>
+        </w:tc>
+        <w:tc>
+          <w:tcPr>
+            <w:tcW w:type="dxa" w:w="1080"/>
+          </w:tcPr>
+          <w:p>
+            <w:r>
+              <w:rPr>
+                <w:sz w:val="20"/>
+              </w:rPr>
+            </w:r>
+            <w:r>
+              <w:rPr>
+                <w:sz w:val="20"/>
+              </w:rPr>
+              <w:t>(54)</w:t>
+            </w:r>
+          </w:p>
+        </w:tc>
+        <w:tc>
+          <w:tcPr>
+            <w:tcW w:type="dxa" w:w="1080"/>
+          </w:tcPr>
+          <w:p>
+            <w:r>
+              <w:rPr>
+                <w:sz w:val="20"/>
+              </w:rPr>
+            </w:r>
+            <w:r>
+              <w:rPr>
+                <w:sz w:val="20"/>
+              </w:rPr>
+              <w:t>(112)</w:t>
+            </w:r>
+          </w:p>
+        </w:tc>
+      </w:tr>
+      <w:tr>
+        <w:tc>
+          <w:tcPr>
+            <w:tcW w:type="dxa" w:w="1080"/>
+          </w:tcPr>
+          <w:p>
+            <w:r>
+              <w:rPr>
+                <w:sz w:val="20"/>
+              </w:rPr>
+            </w:r>
+            <w:r>
+              <w:rPr>
+                <w:sz w:val="20"/>
+              </w:rPr>
+              <w:t>M3</w:t>
+            </w:r>
+          </w:p>
+        </w:tc>
+        <w:tc>
+          <w:tcPr>
+            <w:tcW w:type="dxa" w:w="1080"/>
+          </w:tcPr>
+          <w:p>
+            <w:r>
+              <w:rPr>
+                <w:sz w:val="20"/>
+              </w:rPr>
+            </w:r>
+            <w:r>
+              <w:rPr>
+                <w:sz w:val="20"/>
+              </w:rPr>
+              <w:t>12</w:t>
+            </w:r>
+          </w:p>
+        </w:tc>
+        <w:tc>
+          <w:tcPr>
+            <w:tcW w:type="dxa" w:w="1080"/>
+          </w:tcPr>
+          <w:p>
+            <w:r>
+              <w:rPr>
+                <w:sz w:val="20"/>
+              </w:rPr>
+            </w:r>
+            <w:r>
+              <w:rPr>
+                <w:sz w:val="20"/>
+              </w:rPr>
+              <w:t>10</w:t>
+            </w:r>
+          </w:p>
+        </w:tc>
+        <w:tc>
+          <w:tcPr>
+            <w:tcW w:type="dxa" w:w="1080"/>
+          </w:tcPr>
+          <w:p>
+            <w:r>
+              <w:rPr>
+                <w:sz w:val="20"/>
+              </w:rPr>
+            </w:r>
+            <w:r>
+              <w:rPr>
+                <w:sz w:val="20"/>
+              </w:rPr>
+              <w:t>40</w:t>
+            </w:r>
+          </w:p>
+        </w:tc>
+        <w:tc>
+          <w:tcPr>
+            <w:tcW w:type="dxa" w:w="1080"/>
+          </w:tcPr>
+          <w:p>
+            <w:r>
+              <w:rPr>
+                <w:sz w:val="20"/>
+              </w:rPr>
+            </w:r>
+            <w:r>
+              <w:rPr>
+                <w:sz w:val="20"/>
+              </w:rPr>
+              <w:t>14</w:t>
+            </w:r>
+          </w:p>
+        </w:tc>
+        <w:tc>
+          <w:tcPr>
+            <w:tcW w:type="dxa" w:w="1080"/>
+          </w:tcPr>
+          <w:p>
+            <w:r>
+              <w:rPr>
+                <w:sz w:val="20"/>
+              </w:rPr>
+            </w:r>
+            <w:r>
+              <w:rPr>
+                <w:sz w:val="20"/>
+              </w:rPr>
+              <w:t>64</w:t>
+            </w:r>
+          </w:p>
+        </w:tc>
+        <w:tc>
+          <w:tcPr>
+            <w:tcW w:type="dxa" w:w="1080"/>
+          </w:tcPr>
+          <w:p>
+            <w:r>
+              <w:rPr>
+                <w:sz w:val="20"/>
+              </w:rPr>
+            </w:r>
+            <w:r>
+              <w:rPr>
+                <w:sz w:val="20"/>
+              </w:rPr>
+              <w:t>(52)</w:t>
+            </w:r>
+          </w:p>
+        </w:tc>
+        <w:tc>
+          <w:tcPr>
+            <w:tcW w:type="dxa" w:w="1080"/>
+          </w:tcPr>
+          <w:p>
+            <w:r>
+              <w:rPr>
+                <w:sz w:val="20"/>
+              </w:rPr>
+            </w:r>
+            <w:r>
+              <w:rPr>
+                <w:sz w:val="20"/>
+              </w:rPr>
+              <w:t>(164)</w:t>
+            </w:r>
+          </w:p>
+        </w:tc>
+      </w:tr>
+      <w:tr>
+        <w:tc>
+          <w:tcPr>
+            <w:tcW w:type="dxa" w:w="1080"/>
+          </w:tcPr>
+          <w:p>
+            <w:r>
+              <w:rPr>
+                <w:sz w:val="20"/>
+              </w:rPr>
+            </w:r>
+            <w:r>
+              <w:rPr>
+                <w:sz w:val="20"/>
+              </w:rPr>
+              <w:t>M4</w:t>
+            </w:r>
+          </w:p>
+        </w:tc>
+        <w:tc>
+          <w:tcPr>
+            <w:tcW w:type="dxa" w:w="1080"/>
+          </w:tcPr>
+          <w:p>
+            <w:r>
+              <w:rPr>
+                <w:sz w:val="20"/>
+              </w:rPr>
+            </w:r>
+            <w:r>
+              <w:rPr>
+                <w:sz w:val="20"/>
+              </w:rPr>
+              <w:t>15</w:t>
+            </w:r>
+          </w:p>
+        </w:tc>
+        <w:tc>
+          <w:tcPr>
+            <w:tcW w:type="dxa" w:w="1080"/>
+          </w:tcPr>
+          <w:p>
+            <w:r>
+              <w:rPr>
+                <w:sz w:val="20"/>
+              </w:rPr>
+            </w:r>
+            <w:r>
+              <w:rPr>
+                <w:sz w:val="20"/>
+              </w:rPr>
+              <w:t>10</w:t>
+            </w:r>
+          </w:p>
+        </w:tc>
+        <w:tc>
+          <w:tcPr>
+            <w:tcW w:type="dxa" w:w="1080"/>
+          </w:tcPr>
+          <w:p>
+            <w:r>
+              <w:rPr>
+                <w:sz w:val="20"/>
+              </w:rPr>
+            </w:r>
+            <w:r>
+              <w:rPr>
+                <w:sz w:val="20"/>
+              </w:rPr>
+              <w:t>38</w:t>
+            </w:r>
+          </w:p>
+        </w:tc>
+        <w:tc>
+          <w:tcPr>
+            <w:tcW w:type="dxa" w:w="1080"/>
+          </w:tcPr>
+          <w:p>
+            <w:r>
+              <w:rPr>
+                <w:sz w:val="20"/>
+              </w:rPr>
+            </w:r>
+            <w:r>
+              <w:rPr>
+                <w:sz w:val="20"/>
+              </w:rPr>
+              <w:t>15</w:t>
+            </w:r>
+          </w:p>
+        </w:tc>
+        <w:tc>
+          <w:tcPr>
+            <w:tcW w:type="dxa" w:w="1080"/>
+          </w:tcPr>
+          <w:p>
+            <w:r>
+              <w:rPr>
+                <w:sz w:val="20"/>
+              </w:rPr>
+            </w:r>
+            <w:r>
+              <w:rPr>
+                <w:sz w:val="20"/>
+              </w:rPr>
+              <w:t>63</w:t>
+            </w:r>
+          </w:p>
+        </w:tc>
+        <w:tc>
+          <w:tcPr>
+            <w:tcW w:type="dxa" w:w="1080"/>
+          </w:tcPr>
+          <w:p>
+            <w:r>
+              <w:rPr>
+                <w:sz w:val="20"/>
+              </w:rPr>
+            </w:r>
+            <w:r>
+              <w:rPr>
+                <w:sz w:val="20"/>
+              </w:rPr>
+              <w:t>(48)</w:t>
+            </w:r>
+          </w:p>
+        </w:tc>
+        <w:tc>
+          <w:tcPr>
+            <w:tcW w:type="dxa" w:w="1080"/>
+          </w:tcPr>
+          <w:p>
+            <w:r>
+              <w:rPr>
+                <w:sz w:val="20"/>
+              </w:rPr>
+            </w:r>
+            <w:r>
+              <w:rPr>
+                <w:sz w:val="20"/>
+              </w:rPr>
+              <w:t>(212)</w:t>
+            </w:r>
+          </w:p>
+        </w:tc>
+      </w:tr>
+      <w:tr>
+        <w:tc>
+          <w:tcPr>
+            <w:tcW w:type="dxa" w:w="1080"/>
+          </w:tcPr>
+          <w:p>
+            <w:r>
+              <w:rPr>
+                <w:sz w:val="20"/>
+              </w:rPr>
+            </w:r>
+            <w:r>
+              <w:rPr>
+                <w:sz w:val="20"/>
+              </w:rPr>
+              <w:t>M5</w:t>
+            </w:r>
+          </w:p>
+        </w:tc>
+        <w:tc>
+          <w:tcPr>
+            <w:tcW w:type="dxa" w:w="1080"/>
+          </w:tcPr>
+          <w:p>
+            <w:r>
+              <w:rPr>
+                <w:sz w:val="20"/>
+              </w:rPr>
+            </w:r>
+            <w:r>
+              <w:rPr>
+                <w:sz w:val="20"/>
+              </w:rPr>
+              <w:t>20</w:t>
+            </w:r>
+          </w:p>
+        </w:tc>
+        <w:tc>
+          <w:tcPr>
+            <w:tcW w:type="dxa" w:w="1080"/>
+          </w:tcPr>
+          <w:p>
+            <w:r>
+              <w:rPr>
+                <w:sz w:val="20"/>
+              </w:rPr>
+            </w:r>
+            <w:r>
+              <w:rPr>
+                <w:sz w:val="20"/>
+              </w:rPr>
+              <w:t>12</w:t>
+            </w:r>
+          </w:p>
+        </w:tc>
+        <w:tc>
+          <w:tcPr>
+            <w:tcW w:type="dxa" w:w="1080"/>
+          </w:tcPr>
+          <w:p>
+            <w:r>
+              <w:rPr>
+                <w:sz w:val="20"/>
+              </w:rPr>
+            </w:r>
+            <w:r>
+              <w:rPr>
+                <w:sz w:val="20"/>
+              </w:rPr>
+              <w:t>38</w:t>
+            </w:r>
+          </w:p>
+        </w:tc>
+        <w:tc>
+          <w:tcPr>
+            <w:tcW w:type="dxa" w:w="1080"/>
+          </w:tcPr>
+          <w:p>
+            <w:r>
+              <w:rPr>
+                <w:sz w:val="20"/>
+              </w:rPr>
+            </w:r>
+            <w:r>
+              <w:rPr>
+                <w:sz w:val="20"/>
+              </w:rPr>
+              <w:t>16</w:t>
+            </w:r>
+          </w:p>
+        </w:tc>
+        <w:tc>
+          <w:tcPr>
+            <w:tcW w:type="dxa" w:w="1080"/>
+          </w:tcPr>
+          <w:p>
+            <w:r>
+              <w:rPr>
+                <w:sz w:val="20"/>
+              </w:rPr>
+            </w:r>
+            <w:r>
+              <w:rPr>
+                <w:sz w:val="20"/>
+              </w:rPr>
+              <w:t>66</w:t>
+            </w:r>
+          </w:p>
+        </w:tc>
+        <w:tc>
+          <w:tcPr>
+            <w:tcW w:type="dxa" w:w="1080"/>
+          </w:tcPr>
+          <w:p>
+            <w:r>
+              <w:rPr>
+                <w:sz w:val="20"/>
+              </w:rPr>
+            </w:r>
+            <w:r>
+              <w:rPr>
+                <w:sz w:val="20"/>
+              </w:rPr>
+              <w:t>(46)</w:t>
+            </w:r>
+          </w:p>
+        </w:tc>
+        <w:tc>
+          <w:tcPr>
+            <w:tcW w:type="dxa" w:w="1080"/>
+          </w:tcPr>
+          <w:p>
+            <w:r>
+              <w:rPr>
+                <w:sz w:val="20"/>
+              </w:rPr>
+            </w:r>
+            <w:r>
+              <w:rPr>
+                <w:sz w:val="20"/>
+              </w:rPr>
+              <w:t>(258)</w:t>
+            </w:r>
+          </w:p>
+        </w:tc>
+      </w:tr>
+      <w:tr>
+        <w:tc>
+          <w:tcPr>
+            <w:tcW w:type="dxa" w:w="1080"/>
+          </w:tcPr>
+          <w:p>
+            <w:r>
+              <w:rPr>
+                <w:sz w:val="20"/>
+              </w:rPr>
+            </w:r>
+            <w:r>
+              <w:rPr>
+                <w:sz w:val="20"/>
+              </w:rPr>
+              <w:t>M6</w:t>
+            </w:r>
+          </w:p>
+        </w:tc>
+        <w:tc>
+          <w:tcPr>
+            <w:tcW w:type="dxa" w:w="1080"/>
+          </w:tcPr>
+          <w:p>
+            <w:r>
+              <w:rPr>
+                <w:sz w:val="20"/>
+              </w:rPr>
+            </w:r>
+            <w:r>
+              <w:rPr>
+                <w:sz w:val="20"/>
+              </w:rPr>
+              <w:t>25</w:t>
+            </w:r>
+          </w:p>
+        </w:tc>
+        <w:tc>
+          <w:tcPr>
+            <w:tcW w:type="dxa" w:w="1080"/>
+          </w:tcPr>
+          <w:p>
+            <w:r>
+              <w:rPr>
+                <w:sz w:val="20"/>
+              </w:rPr>
+            </w:r>
+            <w:r>
+              <w:rPr>
+                <w:sz w:val="20"/>
+              </w:rPr>
+              <w:t>12</w:t>
+            </w:r>
+          </w:p>
+        </w:tc>
+        <w:tc>
+          <w:tcPr>
+            <w:tcW w:type="dxa" w:w="1080"/>
+          </w:tcPr>
+          <w:p>
+            <w:r>
+              <w:rPr>
+                <w:sz w:val="20"/>
+              </w:rPr>
+            </w:r>
+            <w:r>
+              <w:rPr>
+                <w:sz w:val="20"/>
+              </w:rPr>
+              <w:t>37</w:t>
+            </w:r>
+          </w:p>
+        </w:tc>
+        <w:tc>
+          <w:tcPr>
+            <w:tcW w:type="dxa" w:w="1080"/>
+          </w:tcPr>
+          <w:p>
+            <w:r>
+              <w:rPr>
+                <w:sz w:val="20"/>
+              </w:rPr>
+            </w:r>
+            <w:r>
+              <w:rPr>
+                <w:sz w:val="20"/>
+              </w:rPr>
+              <w:t>17</w:t>
+            </w:r>
+          </w:p>
+        </w:tc>
+        <w:tc>
+          <w:tcPr>
+            <w:tcW w:type="dxa" w:w="1080"/>
+          </w:tcPr>
+          <w:p>
+            <w:r>
+              <w:rPr>
+                <w:sz w:val="20"/>
+              </w:rPr>
+            </w:r>
+            <w:r>
+              <w:rPr>
+                <w:sz w:val="20"/>
+              </w:rPr>
+              <w:t>66</w:t>
+            </w:r>
+          </w:p>
+        </w:tc>
+        <w:tc>
+          <w:tcPr>
+            <w:tcW w:type="dxa" w:w="1080"/>
+          </w:tcPr>
+          <w:p>
+            <w:r>
+              <w:rPr>
+                <w:sz w:val="20"/>
+              </w:rPr>
+            </w:r>
+            <w:r>
+              <w:rPr>
+                <w:sz w:val="20"/>
+              </w:rPr>
+              <w:t>(41)</w:t>
+            </w:r>
+          </w:p>
+        </w:tc>
+        <w:tc>
+          <w:tcPr>
+            <w:tcW w:type="dxa" w:w="1080"/>
+          </w:tcPr>
+          <w:p>
+            <w:r>
+              <w:rPr>
+                <w:sz w:val="20"/>
+              </w:rPr>
+            </w:r>
+            <w:r>
+              <w:rPr>
+                <w:sz w:val="20"/>
+              </w:rPr>
+              <w:t>(299)</w:t>
+            </w:r>
+          </w:p>
+        </w:tc>
+      </w:tr>
+      <w:tr>
+        <w:tc>
+          <w:tcPr>
+            <w:tcW w:type="dxa" w:w="1080"/>
+          </w:tcPr>
+          <w:p>
+            <w:r>
+              <w:rPr>
+                <w:sz w:val="20"/>
+              </w:rPr>
+            </w:r>
+            <w:r>
+              <w:rPr>
+                <w:sz w:val="20"/>
+              </w:rPr>
+              <w:t>M7</w:t>
+            </w:r>
+          </w:p>
+        </w:tc>
+        <w:tc>
+          <w:tcPr>
+            <w:tcW w:type="dxa" w:w="1080"/>
+          </w:tcPr>
+          <w:p>
+            <w:r>
+              <w:rPr>
+                <w:sz w:val="20"/>
+              </w:rPr>
+            </w:r>
+            <w:r>
+              <w:rPr>
+                <w:sz w:val="20"/>
+              </w:rPr>
+              <w:t>30</w:t>
+            </w:r>
+          </w:p>
+        </w:tc>
+        <w:tc>
+          <w:tcPr>
+            <w:tcW w:type="dxa" w:w="1080"/>
+          </w:tcPr>
+          <w:p>
+            <w:r>
+              <w:rPr>
+                <w:sz w:val="20"/>
+              </w:rPr>
+            </w:r>
+            <w:r>
+              <w:rPr>
+                <w:sz w:val="20"/>
+              </w:rPr>
+              <w:t>13</w:t>
+            </w:r>
+          </w:p>
+        </w:tc>
+        <w:tc>
+          <w:tcPr>
+            <w:tcW w:type="dxa" w:w="1080"/>
+          </w:tcPr>
+          <w:p>
+            <w:r>
+              <w:rPr>
+                <w:sz w:val="20"/>
+              </w:rPr>
+            </w:r>
+            <w:r>
+              <w:rPr>
+                <w:sz w:val="20"/>
+              </w:rPr>
+              <w:t>37</w:t>
+            </w:r>
+          </w:p>
+        </w:tc>
+        <w:tc>
+          <w:tcPr>
+            <w:tcW w:type="dxa" w:w="1080"/>
+          </w:tcPr>
+          <w:p>
+            <w:r>
+              <w:rPr>
+                <w:sz w:val="20"/>
+              </w:rPr>
+            </w:r>
+            <w:r>
+              <w:rPr>
+                <w:sz w:val="20"/>
+              </w:rPr>
+              <w:t>18</w:t>
+            </w:r>
+          </w:p>
+        </w:tc>
+        <w:tc>
+          <w:tcPr>
+            <w:tcW w:type="dxa" w:w="1080"/>
+          </w:tcPr>
+          <w:p>
+            <w:r>
+              <w:rPr>
+                <w:sz w:val="20"/>
+              </w:rPr>
+            </w:r>
+            <w:r>
+              <w:rPr>
+                <w:sz w:val="20"/>
+              </w:rPr>
+              <w:t>68</w:t>
+            </w:r>
+          </w:p>
+        </w:tc>
+        <w:tc>
+          <w:tcPr>
+            <w:tcW w:type="dxa" w:w="1080"/>
+          </w:tcPr>
+          <w:p>
+            <w:r>
+              <w:rPr>
+                <w:sz w:val="20"/>
+              </w:rPr>
+            </w:r>
+            <w:r>
+              <w:rPr>
+                <w:sz w:val="20"/>
+              </w:rPr>
+              <w:t>(38)</w:t>
+            </w:r>
+          </w:p>
+        </w:tc>
+        <w:tc>
+          <w:tcPr>
+            <w:tcW w:type="dxa" w:w="1080"/>
+          </w:tcPr>
+          <w:p>
+            <w:r>
+              <w:rPr>
+                <w:sz w:val="20"/>
+              </w:rPr>
+            </w:r>
+            <w:r>
+              <w:rPr>
+                <w:sz w:val="20"/>
+              </w:rPr>
+              <w:t>(337)</w:t>
+            </w:r>
+          </w:p>
+        </w:tc>
+      </w:tr>
+      <w:tr>
+        <w:tc>
+          <w:tcPr>
+            <w:tcW w:type="dxa" w:w="1080"/>
+          </w:tcPr>
+          <w:p>
+            <w:r>
+              <w:rPr>
+                <w:sz w:val="20"/>
+              </w:rPr>
+            </w:r>
+            <w:r>
+              <w:rPr>
+                <w:sz w:val="20"/>
+              </w:rPr>
+              <w:t>M8</w:t>
+            </w:r>
+          </w:p>
+        </w:tc>
+        <w:tc>
+          <w:tcPr>
+            <w:tcW w:type="dxa" w:w="1080"/>
+          </w:tcPr>
+          <w:p>
+            <w:r>
+              <w:rPr>
+                <w:sz w:val="20"/>
+              </w:rPr>
+            </w:r>
+            <w:r>
+              <w:rPr>
+                <w:sz w:val="20"/>
+              </w:rPr>
+              <w:t>38</w:t>
+            </w:r>
+          </w:p>
+        </w:tc>
+        <w:tc>
+          <w:tcPr>
+            <w:tcW w:type="dxa" w:w="1080"/>
+          </w:tcPr>
+          <w:p>
+            <w:r>
+              <w:rPr>
+                <w:sz w:val="20"/>
+              </w:rPr>
+            </w:r>
+            <w:r>
+              <w:rPr>
+                <w:sz w:val="20"/>
+              </w:rPr>
+              <w:t>13</w:t>
+            </w:r>
+          </w:p>
+        </w:tc>
+        <w:tc>
+          <w:tcPr>
+            <w:tcW w:type="dxa" w:w="1080"/>
+          </w:tcPr>
+          <w:p>
+            <w:r>
+              <w:rPr>
+                <w:sz w:val="20"/>
+              </w:rPr>
+            </w:r>
+            <w:r>
+              <w:rPr>
+                <w:sz w:val="20"/>
+              </w:rPr>
+              <w:t>36</w:t>
+            </w:r>
+          </w:p>
+        </w:tc>
+        <w:tc>
+          <w:tcPr>
+            <w:tcW w:type="dxa" w:w="1080"/>
+          </w:tcPr>
+          <w:p>
+            <w:r>
+              <w:rPr>
+                <w:sz w:val="20"/>
+              </w:rPr>
+            </w:r>
+            <w:r>
+              <w:rPr>
+                <w:sz w:val="20"/>
+              </w:rPr>
+              <w:t>18</w:t>
+            </w:r>
+          </w:p>
+        </w:tc>
+        <w:tc>
+          <w:tcPr>
+            <w:tcW w:type="dxa" w:w="1080"/>
+          </w:tcPr>
+          <w:p>
+            <w:r>
+              <w:rPr>
+                <w:sz w:val="20"/>
+              </w:rPr>
+            </w:r>
+            <w:r>
+              <w:rPr>
+                <w:sz w:val="20"/>
+              </w:rPr>
+              <w:t>67</w:t>
+            </w:r>
+          </w:p>
+        </w:tc>
+        <w:tc>
+          <w:tcPr>
+            <w:tcW w:type="dxa" w:w="1080"/>
+          </w:tcPr>
+          <w:p>
+            <w:r>
+              <w:rPr>
+                <w:sz w:val="20"/>
+              </w:rPr>
+            </w:r>
+            <w:r>
+              <w:rPr>
+                <w:sz w:val="20"/>
+              </w:rPr>
+              <w:t>(29)</w:t>
+            </w:r>
+          </w:p>
+        </w:tc>
+        <w:tc>
+          <w:tcPr>
+            <w:tcW w:type="dxa" w:w="1080"/>
+          </w:tcPr>
+          <w:p>
+            <w:r>
+              <w:rPr>
+                <w:sz w:val="20"/>
+              </w:rPr>
+            </w:r>
+            <w:r>
+              <w:rPr>
+                <w:sz w:val="20"/>
+              </w:rPr>
+              <w:t>(366)</w:t>
+            </w:r>
+          </w:p>
+        </w:tc>
+      </w:tr>
+      <w:tr>
+        <w:tc>
+          <w:tcPr>
+            <w:tcW w:type="dxa" w:w="1080"/>
+          </w:tcPr>
+          <w:p>
+            <w:r>
+              <w:rPr>
+                <w:sz w:val="20"/>
+              </w:rPr>
+            </w:r>
+            <w:r>
+              <w:rPr>
+                <w:sz w:val="20"/>
+              </w:rPr>
+              <w:t>M9</w:t>
+            </w:r>
+          </w:p>
+        </w:tc>
+        <w:tc>
+          <w:tcPr>
+            <w:tcW w:type="dxa" w:w="1080"/>
+          </w:tcPr>
+          <w:p>
+            <w:r>
+              <w:rPr>
+                <w:sz w:val="20"/>
+              </w:rPr>
+            </w:r>
+            <w:r>
+              <w:rPr>
+                <w:sz w:val="20"/>
+              </w:rPr>
+              <w:t>45</w:t>
+            </w:r>
+          </w:p>
+        </w:tc>
+        <w:tc>
+          <w:tcPr>
+            <w:tcW w:type="dxa" w:w="1080"/>
+          </w:tcPr>
+          <w:p>
+            <w:r>
+              <w:rPr>
+                <w:sz w:val="20"/>
+              </w:rPr>
+            </w:r>
+            <w:r>
+              <w:rPr>
+                <w:sz w:val="20"/>
+              </w:rPr>
+              <w:t>14</w:t>
+            </w:r>
+          </w:p>
+        </w:tc>
+        <w:tc>
+          <w:tcPr>
+            <w:tcW w:type="dxa" w:w="1080"/>
+          </w:tcPr>
+          <w:p>
+            <w:r>
+              <w:rPr>
+                <w:sz w:val="20"/>
+              </w:rPr>
+            </w:r>
+            <w:r>
+              <w:rPr>
+                <w:sz w:val="20"/>
+              </w:rPr>
+              <w:t>36</w:t>
+            </w:r>
+          </w:p>
+        </w:tc>
+        <w:tc>
+          <w:tcPr>
+            <w:tcW w:type="dxa" w:w="1080"/>
+          </w:tcPr>
+          <w:p>
+            <w:r>
+              <w:rPr>
+                <w:sz w:val="20"/>
+              </w:rPr>
+            </w:r>
+            <w:r>
+              <w:rPr>
+                <w:sz w:val="20"/>
+              </w:rPr>
+              <w:t>19</w:t>
+            </w:r>
+          </w:p>
+        </w:tc>
+        <w:tc>
+          <w:tcPr>
+            <w:tcW w:type="dxa" w:w="1080"/>
+          </w:tcPr>
+          <w:p>
+            <w:r>
+              <w:rPr>
+                <w:sz w:val="20"/>
+              </w:rPr>
+            </w:r>
+            <w:r>
+              <w:rPr>
+                <w:sz w:val="20"/>
+              </w:rPr>
+              <w:t>69</w:t>
+            </w:r>
+          </w:p>
+        </w:tc>
+        <w:tc>
+          <w:tcPr>
+            <w:tcW w:type="dxa" w:w="1080"/>
+          </w:tcPr>
+          <w:p>
+            <w:r>
+              <w:rPr>
+                <w:sz w:val="20"/>
+              </w:rPr>
+            </w:r>
+            <w:r>
+              <w:rPr>
+                <w:sz w:val="20"/>
+              </w:rPr>
+              <w:t>(24)</w:t>
+            </w:r>
+          </w:p>
+        </w:tc>
+        <w:tc>
+          <w:tcPr>
+            <w:tcW w:type="dxa" w:w="1080"/>
+          </w:tcPr>
+          <w:p>
+            <w:r>
+              <w:rPr>
+                <w:sz w:val="20"/>
+              </w:rPr>
+            </w:r>
+            <w:r>
+              <w:rPr>
+                <w:sz w:val="20"/>
+              </w:rPr>
+              <w:t>(390)</w:t>
+            </w:r>
+          </w:p>
+        </w:tc>
+      </w:tr>
+      <w:tr>
+        <w:tc>
+          <w:tcPr>
+            <w:tcW w:type="dxa" w:w="1080"/>
+          </w:tcPr>
+          <w:p>
+            <w:r>
+              <w:rPr>
+                <w:sz w:val="20"/>
+              </w:rPr>
+            </w:r>
+            <w:r>
+              <w:rPr>
+                <w:sz w:val="20"/>
+              </w:rPr>
+              <w:t>M10</w:t>
+            </w:r>
+          </w:p>
+        </w:tc>
+        <w:tc>
+          <w:tcPr>
+            <w:tcW w:type="dxa" w:w="1080"/>
+          </w:tcPr>
+          <w:p>
+            <w:r>
+              <w:rPr>
+                <w:sz w:val="20"/>
+              </w:rPr>
+            </w:r>
+            <w:r>
+              <w:rPr>
+                <w:sz w:val="20"/>
+              </w:rPr>
+              <w:t>55</w:t>
+            </w:r>
+          </w:p>
+        </w:tc>
+        <w:tc>
+          <w:tcPr>
+            <w:tcW w:type="dxa" w:w="1080"/>
+          </w:tcPr>
+          <w:p>
+            <w:r>
+              <w:rPr>
+                <w:sz w:val="20"/>
+              </w:rPr>
+            </w:r>
+            <w:r>
+              <w:rPr>
+                <w:sz w:val="20"/>
+              </w:rPr>
+              <w:t>15</w:t>
+            </w:r>
+          </w:p>
+        </w:tc>
+        <w:tc>
+          <w:tcPr>
+            <w:tcW w:type="dxa" w:w="1080"/>
+          </w:tcPr>
+          <w:p>
+            <w:r>
+              <w:rPr>
+                <w:sz w:val="20"/>
+              </w:rPr>
+            </w:r>
+            <w:r>
+              <w:rPr>
+                <w:sz w:val="20"/>
+              </w:rPr>
+              <w:t>35</w:t>
+            </w:r>
+          </w:p>
+        </w:tc>
+        <w:tc>
+          <w:tcPr>
+            <w:tcW w:type="dxa" w:w="1080"/>
+          </w:tcPr>
+          <w:p>
+            <w:r>
+              <w:rPr>
+                <w:sz w:val="20"/>
+              </w:rPr>
+            </w:r>
+            <w:r>
+              <w:rPr>
+                <w:sz w:val="20"/>
+              </w:rPr>
+              <w:t>20</w:t>
+            </w:r>
+          </w:p>
+        </w:tc>
+        <w:tc>
+          <w:tcPr>
+            <w:tcW w:type="dxa" w:w="1080"/>
+          </w:tcPr>
+          <w:p>
+            <w:r>
+              <w:rPr>
+                <w:sz w:val="20"/>
+              </w:rPr>
+            </w:r>
+            <w:r>
+              <w:rPr>
+                <w:sz w:val="20"/>
+              </w:rPr>
+              <w:t>70</w:t>
+            </w:r>
+          </w:p>
+        </w:tc>
+        <w:tc>
+          <w:tcPr>
+            <w:tcW w:type="dxa" w:w="1080"/>
+          </w:tcPr>
+          <w:p>
+            <w:r>
+              <w:rPr>
+                <w:sz w:val="20"/>
+              </w:rPr>
+            </w:r>
+            <w:r>
+              <w:rPr>
+                <w:sz w:val="20"/>
+              </w:rPr>
+              <w:t>(15)</w:t>
+            </w:r>
+          </w:p>
+        </w:tc>
+        <w:tc>
+          <w:tcPr>
+            <w:tcW w:type="dxa" w:w="1080"/>
+          </w:tcPr>
+          <w:p>
+            <w:r>
+              <w:rPr>
+                <w:sz w:val="20"/>
+              </w:rPr>
+            </w:r>
+            <w:r>
+              <w:rPr>
+                <w:sz w:val="20"/>
+              </w:rPr>
+              <w:t>(405)</w:t>
+            </w:r>
+          </w:p>
+        </w:tc>
+      </w:tr>
+      <w:tr>
+        <w:tc>
+          <w:tcPr>
+            <w:tcW w:type="dxa" w:w="1080"/>
+          </w:tcPr>
+          <w:p>
+            <w:r>
+              <w:rPr>
+                <w:sz w:val="20"/>
+              </w:rPr>
+            </w:r>
+            <w:r>
+              <w:rPr>
+                <w:sz w:val="20"/>
+              </w:rPr>
+              <w:t>M11</w:t>
+            </w:r>
+          </w:p>
+        </w:tc>
+        <w:tc>
+          <w:tcPr>
+            <w:tcW w:type="dxa" w:w="1080"/>
+          </w:tcPr>
+          <w:p>
+            <w:r>
+              <w:rPr>
+                <w:sz w:val="20"/>
+              </w:rPr>
+            </w:r>
+            <w:r>
+              <w:rPr>
+                <w:sz w:val="20"/>
+              </w:rPr>
+              <w:t>68</w:t>
+            </w:r>
+          </w:p>
+        </w:tc>
+        <w:tc>
+          <w:tcPr>
+            <w:tcW w:type="dxa" w:w="1080"/>
+          </w:tcPr>
+          <w:p>
+            <w:r>
+              <w:rPr>
+                <w:sz w:val="20"/>
+              </w:rPr>
+            </w:r>
+            <w:r>
+              <w:rPr>
+                <w:sz w:val="20"/>
+              </w:rPr>
+              <w:t>17</w:t>
+            </w:r>
+          </w:p>
+        </w:tc>
+        <w:tc>
+          <w:tcPr>
+            <w:tcW w:type="dxa" w:w="1080"/>
+          </w:tcPr>
+          <w:p>
+            <w:r>
+              <w:rPr>
+                <w:sz w:val="20"/>
+              </w:rPr>
+            </w:r>
+            <w:r>
+              <w:rPr>
+                <w:sz w:val="20"/>
+              </w:rPr>
+              <w:t>35</w:t>
+            </w:r>
+          </w:p>
+        </w:tc>
+        <w:tc>
+          <w:tcPr>
+            <w:tcW w:type="dxa" w:w="1080"/>
+          </w:tcPr>
+          <w:p>
+            <w:r>
+              <w:rPr>
+                <w:sz w:val="20"/>
+              </w:rPr>
+            </w:r>
+            <w:r>
+              <w:rPr>
+                <w:sz w:val="20"/>
+              </w:rPr>
+              <w:t>20</w:t>
+            </w:r>
+          </w:p>
+        </w:tc>
+        <w:tc>
+          <w:tcPr>
+            <w:tcW w:type="dxa" w:w="1080"/>
+          </w:tcPr>
+          <w:p>
+            <w:r>
+              <w:rPr>
+                <w:sz w:val="20"/>
+              </w:rPr>
+            </w:r>
+            <w:r>
+              <w:rPr>
+                <w:sz w:val="20"/>
+              </w:rPr>
+              <w:t>72</w:t>
+            </w:r>
+          </w:p>
+        </w:tc>
+        <w:tc>
+          <w:tcPr>
+            <w:tcW w:type="dxa" w:w="1080"/>
+          </w:tcPr>
+          <w:p>
+            <w:r>
+              <w:rPr>
+                <w:sz w:val="20"/>
+              </w:rPr>
+            </w:r>
+            <w:r>
+              <w:rPr>
+                <w:sz w:val="20"/>
+              </w:rPr>
+              <w:t>(4)</w:t>
+            </w:r>
+          </w:p>
+        </w:tc>
+        <w:tc>
+          <w:tcPr>
+            <w:tcW w:type="dxa" w:w="1080"/>
+          </w:tcPr>
+          <w:p>
+            <w:r>
+              <w:rPr>
+                <w:sz w:val="20"/>
+              </w:rPr>
+            </w:r>
+            <w:r>
+              <w:rPr>
+                <w:sz w:val="20"/>
+              </w:rPr>
+              <w:t>(409)</w:t>
+            </w:r>
+          </w:p>
+        </w:tc>
+      </w:tr>
+      <w:tr>
+        <w:tc>
+          <w:tcPr>
+            <w:tcW w:type="dxa" w:w="1080"/>
+          </w:tcPr>
+          <w:p>
+            <w:r>
+              <w:rPr>
+                <w:sz w:val="20"/>
+              </w:rPr>
+            </w:r>
+            <w:r>
+              <w:rPr>
+                <w:sz w:val="20"/>
+              </w:rPr>
+              <w:t>M12</w:t>
+            </w:r>
+          </w:p>
+        </w:tc>
+        <w:tc>
+          <w:tcPr>
+            <w:tcW w:type="dxa" w:w="1080"/>
+          </w:tcPr>
+          <w:p>
+            <w:r>
+              <w:rPr>
+                <w:sz w:val="20"/>
+              </w:rPr>
+            </w:r>
+            <w:r>
+              <w:rPr>
+                <w:sz w:val="20"/>
+              </w:rPr>
+              <w:t>79</w:t>
+            </w:r>
+          </w:p>
+        </w:tc>
+        <w:tc>
+          <w:tcPr>
+            <w:tcW w:type="dxa" w:w="1080"/>
+          </w:tcPr>
+          <w:p>
+            <w:r>
+              <w:rPr>
+                <w:sz w:val="20"/>
+              </w:rPr>
+            </w:r>
+            <w:r>
+              <w:rPr>
+                <w:sz w:val="20"/>
+              </w:rPr>
+              <w:t>18</w:t>
+            </w:r>
+          </w:p>
+        </w:tc>
+        <w:tc>
+          <w:tcPr>
+            <w:tcW w:type="dxa" w:w="1080"/>
+          </w:tcPr>
+          <w:p>
+            <w:r>
+              <w:rPr>
+                <w:sz w:val="20"/>
+              </w:rPr>
+            </w:r>
+            <w:r>
+              <w:rPr>
+                <w:sz w:val="20"/>
+              </w:rPr>
+              <w:t>31</w:t>
+            </w:r>
+          </w:p>
+        </w:tc>
+        <w:tc>
+          <w:tcPr>
+            <w:tcW w:type="dxa" w:w="1080"/>
+          </w:tcPr>
+          <w:p>
+            <w:r>
+              <w:rPr>
+                <w:sz w:val="20"/>
+              </w:rPr>
+            </w:r>
+            <w:r>
+              <w:rPr>
+                <w:sz w:val="20"/>
+              </w:rPr>
+              <w:t>21</w:t>
+            </w:r>
+          </w:p>
+        </w:tc>
+        <w:tc>
+          <w:tcPr>
+            <w:tcW w:type="dxa" w:w="1080"/>
+          </w:tcPr>
+          <w:p>
+            <w:r>
+              <w:rPr>
+                <w:sz w:val="20"/>
+              </w:rPr>
+            </w:r>
+            <w:r>
+              <w:rPr>
+                <w:sz w:val="20"/>
+              </w:rPr>
+              <w:t>70</w:t>
+            </w:r>
+          </w:p>
+        </w:tc>
+        <w:tc>
+          <w:tcPr>
+            <w:tcW w:type="dxa" w:w="1080"/>
+          </w:tcPr>
+          <w:p>
+            <w:r>
+              <w:rPr>
+                <w:sz w:val="20"/>
+              </w:rPr>
+            </w:r>
+            <w:r>
+              <w:rPr>
+                <w:sz w:val="20"/>
+              </w:rPr>
+              <w:t>9</w:t>
+            </w:r>
+          </w:p>
+        </w:tc>
+        <w:tc>
+          <w:tcPr>
+            <w:tcW w:type="dxa" w:w="1080"/>
+          </w:tcPr>
+          <w:p>
+            <w:r>
+              <w:rPr>
+                <w:sz w:val="20"/>
+              </w:rPr>
+            </w:r>
+            <w:r>
+              <w:rPr>
+                <w:sz w:val="20"/>
+              </w:rPr>
+              <w:t>(400)</w:t>
+            </w:r>
+          </w:p>
+        </w:tc>
+      </w:tr>
+      <w:tr>
+        <w:tc>
+          <w:tcPr>
+            <w:tcW w:type="dxa" w:w="1080"/>
+          </w:tcPr>
+          <w:p>
+            <w:r>
+              <w:rPr>
+                <w:sz w:val="20"/>
+              </w:rPr>
+            </w:r>
+            <w:r>
+              <w:rPr>
+                <w:b/>
+                <w:sz w:val="20"/>
+              </w:rPr>
+              <w:t>Total</w:t>
+            </w:r>
+          </w:p>
+        </w:tc>
+        <w:tc>
+          <w:tcPr>
+            <w:tcW w:type="dxa" w:w="1080"/>
+          </w:tcPr>
+          <w:p>
+            <w:r>
+              <w:rPr>
+                <w:sz w:val="20"/>
+              </w:rPr>
+            </w:r>
+            <w:r>
+              <w:rPr>
+                <w:b/>
+                <w:sz w:val="20"/>
+              </w:rPr>
+              <w:t>400</w:t>
+            </w:r>
+          </w:p>
+        </w:tc>
+        <w:tc>
+          <w:tcPr>
+            <w:tcW w:type="dxa" w:w="1080"/>
+          </w:tcPr>
+          <w:p>
+            <w:r>
+              <w:rPr>
+                <w:sz w:val="20"/>
+              </w:rPr>
+            </w:r>
+            <w:r>
+              <w:rPr>
+                <w:b/>
+                <w:sz w:val="20"/>
+              </w:rPr>
+              <w:t>150</w:t>
+            </w:r>
+          </w:p>
+        </w:tc>
+        <w:tc>
+          <w:tcPr>
+            <w:tcW w:type="dxa" w:w="1080"/>
+          </w:tcPr>
+          <w:p>
+            <w:r>
+              <w:rPr>
+                <w:sz w:val="20"/>
+              </w:rPr>
+            </w:r>
+            <w:r>
+              <w:rPr>
+                <w:b/>
+                <w:sz w:val="20"/>
+              </w:rPr>
+              <w:t>450</w:t>
+            </w:r>
+          </w:p>
+        </w:tc>
+        <w:tc>
+          <w:tcPr>
+            <w:tcW w:type="dxa" w:w="1080"/>
+          </w:tcPr>
+          <w:p>
+            <w:r>
+              <w:rPr>
+                <w:sz w:val="20"/>
+              </w:rPr>
+            </w:r>
+            <w:r>
+              <w:rPr>
+                <w:b/>
+                <w:sz w:val="20"/>
+              </w:rPr>
+              <w:t>200</w:t>
+            </w:r>
+          </w:p>
+        </w:tc>
+        <w:tc>
+          <w:tcPr>
+            <w:tcW w:type="dxa" w:w="1080"/>
+          </w:tcPr>
+          <w:p>
+            <w:r>
+              <w:rPr>
+                <w:sz w:val="20"/>
+              </w:rPr>
+            </w:r>
+            <w:r>
+              <w:rPr>
+                <w:b/>
+                <w:sz w:val="20"/>
+              </w:rPr>
+              <w:t>800</w:t>
+            </w:r>
+          </w:p>
+        </w:tc>
+        <w:tc>
+          <w:tcPr>
+            <w:tcW w:type="dxa" w:w="1080"/>
+          </w:tcPr>
+          <w:p>
+            <w:r>
+              <w:rPr>
+                <w:sz w:val="20"/>
+              </w:rPr>
+            </w:r>
+            <w:r>
+              <w:rPr>
+                <w:b/>
+                <w:sz w:val="20"/>
+              </w:rPr>
+              <w:t>(400)</w:t>
+            </w:r>
+          </w:p>
+        </w:tc>
+        <w:tc>
+          <w:tcPr>
+            <w:tcW w:type="dxa" w:w="1080"/>
+          </w:tcPr>
+          <w:p>
+            <w:r>
+              <w:rPr>
+                <w:sz w:val="20"/>
+              </w:rPr>
+            </w:r>
+            <w:r>
+              <w:rPr>
+                <w:sz w:val="20"/>
+              </w:rPr>
+              <w:t>—</w:t>
+            </w:r>
+          </w:p>
+        </w:tc>
+      </w:tr>
+    </w:tbl>
+    <w:p>
+      <w:r>
+        <w:t xml:space="preserve">Peak intra-year cash need ≈ </w:t>
+      </w:r>
+      <w:r>
+        <w:rPr>
+          <w:b/>
+        </w:rPr>
+        <w:t>$409K</w:t>
+      </w:r>
+      <w:r>
+        <w:t xml:space="preserve"> (M11); monthly burn narrows from ~$58K (M1) to cash-positive by M12 as ARPU and graduated markets compound.</w:t>
+      </w:r>
+    </w:p>
+    <w:p>
+      <w:r>
+        <w:rPr>
+          <w:b/>
+        </w:rPr>
+        <w:t>(c) Years 2–3 — quarterly operating cash flow.</w:t>
+      </w:r>
+    </w:p>
+    <w:tbl>
+      <w:tblPr>
+        <w:tblStyle w:val="TableGrid"/>
+        <w:tblW w:type="auto" w:w="0"/>
+        <w:tblLayout w:type="autofit"/>
+        <w:tblLook w:firstColumn="1" w:firstRow="1" w:lastColumn="0" w:lastRow="0" w:noHBand="0" w:noVBand="1" w:val="04A0"/>
+      </w:tblPr>
+      <w:tblGrid>
+        <w:gridCol w:w="1728"/>
+        <w:gridCol w:w="1728"/>
+        <w:gridCol w:w="1728"/>
+        <w:gridCol w:w="1728"/>
+        <w:gridCol w:w="1728"/>
+      </w:tblGrid>
+      <w:tr>
+        <w:tc>
+          <w:tcPr>
+            <w:tcW w:type="dxa" w:w="1728"/>
+            <w:shd w:val="clear" w:fill="DBE5F1"/>
+          </w:tcPr>
+          <w:p>
+            <w:r>
+              <w:rPr>
+                <w:b/>
+                <w:sz w:val="20"/>
+              </w:rPr>
+            </w:r>
+            <w:r>
+              <w:rPr>
+                <w:b/>
+                <w:sz w:val="20"/>
+              </w:rPr>
+              <w:t>Quarter</w:t>
+            </w:r>
+          </w:p>
+        </w:tc>
+        <w:tc>
+          <w:tcPr>
+            <w:tcW w:type="dxa" w:w="1728"/>
+            <w:shd w:val="clear" w:fill="DBE5F1"/>
+          </w:tcPr>
+          <w:p>
+            <w:r>
+              <w:rPr>
+                <w:b/>
+                <w:sz w:val="20"/>
+              </w:rPr>
+            </w:r>
+            <w:r>
+              <w:rPr>
+                <w:b/>
+                <w:sz w:val="20"/>
+              </w:rPr>
+              <w:t>Revenue</w:t>
+            </w:r>
+          </w:p>
+        </w:tc>
+        <w:tc>
+          <w:tcPr>
+            <w:tcW w:type="dxa" w:w="1728"/>
+            <w:shd w:val="clear" w:fill="DBE5F1"/>
+          </w:tcPr>
+          <w:p>
+            <w:r>
+              <w:rPr>
+                <w:b/>
+                <w:sz w:val="20"/>
+              </w:rPr>
+            </w:r>
+            <w:r>
+              <w:rPr>
+                <w:b/>
+                <w:sz w:val="20"/>
+              </w:rPr>
+              <w:t>Total cost</w:t>
+            </w:r>
+          </w:p>
+        </w:tc>
+        <w:tc>
+          <w:tcPr>
+            <w:tcW w:type="dxa" w:w="1728"/>
+            <w:shd w:val="clear" w:fill="DBE5F1"/>
+          </w:tcPr>
+          <w:p>
+            <w:r>
+              <w:rPr>
+                <w:b/>
+                <w:sz w:val="20"/>
+              </w:rPr>
+            </w:r>
+            <w:r>
+              <w:rPr>
+                <w:b/>
+                <w:sz w:val="20"/>
+              </w:rPr>
+              <w:t>Net CF</w:t>
+            </w:r>
+          </w:p>
+        </w:tc>
+        <w:tc>
+          <w:tcPr>
+            <w:tcW w:type="dxa" w:w="1728"/>
+            <w:shd w:val="clear" w:fill="DBE5F1"/>
+          </w:tcPr>
+          <w:p>
+            <w:r>
+              <w:rPr>
+                <w:b/>
+                <w:sz w:val="20"/>
+              </w:rPr>
+            </w:r>
+            <w:r>
+              <w:rPr>
+                <w:b/>
+                <w:sz w:val="20"/>
+              </w:rPr>
+              <w:t>Cumulative (from Y2 start)</w:t>
+            </w:r>
+          </w:p>
+        </w:tc>
+      </w:tr>
+      <w:tr>
+        <w:tc>
+          <w:tcPr>
+            <w:tcW w:type="dxa" w:w="1728"/>
+          </w:tcPr>
+          <w:p>
+            <w:r>
+              <w:rPr>
+                <w:sz w:val="20"/>
+              </w:rPr>
+            </w:r>
+            <w:r>
+              <w:rPr>
+                <w:sz w:val="20"/>
+              </w:rPr>
+              <w:t>Y2 Q1</w:t>
+            </w:r>
+          </w:p>
+        </w:tc>
+        <w:tc>
+          <w:tcPr>
+            <w:tcW w:type="dxa" w:w="1728"/>
+          </w:tcPr>
+          <w:p>
+            <w:r>
+              <w:rPr>
+                <w:sz w:val="20"/>
+              </w:rPr>
+            </w:r>
+            <w:r>
+              <w:rPr>
+                <w:sz w:val="20"/>
+              </w:rPr>
+              <w:t>250</w:t>
+            </w:r>
+          </w:p>
+        </w:tc>
+        <w:tc>
+          <w:tcPr>
+            <w:tcW w:type="dxa" w:w="1728"/>
+          </w:tcPr>
+          <w:p>
+            <w:r>
+              <w:rPr>
+                <w:sz w:val="20"/>
+              </w:rPr>
+            </w:r>
+            <w:r>
+              <w:rPr>
+                <w:sz w:val="20"/>
+              </w:rPr>
+              <w:t>460</w:t>
+            </w:r>
+          </w:p>
+        </w:tc>
+        <w:tc>
+          <w:tcPr>
+            <w:tcW w:type="dxa" w:w="1728"/>
+          </w:tcPr>
+          <w:p>
+            <w:r>
+              <w:rPr>
+                <w:sz w:val="20"/>
+              </w:rPr>
+            </w:r>
+            <w:r>
+              <w:rPr>
+                <w:sz w:val="20"/>
+              </w:rPr>
+              <w:t>(210)</w:t>
+            </w:r>
+          </w:p>
+        </w:tc>
+        <w:tc>
+          <w:tcPr>
+            <w:tcW w:type="dxa" w:w="1728"/>
+          </w:tcPr>
+          <w:p>
+            <w:r>
+              <w:rPr>
+                <w:sz w:val="20"/>
+              </w:rPr>
+            </w:r>
+            <w:r>
+              <w:rPr>
+                <w:sz w:val="20"/>
+              </w:rPr>
+              <w:t>(210)</w:t>
+            </w:r>
+          </w:p>
+        </w:tc>
+      </w:tr>
+      <w:tr>
+        <w:tc>
+          <w:tcPr>
+            <w:tcW w:type="dxa" w:w="1728"/>
+          </w:tcPr>
+          <w:p>
+            <w:r>
+              <w:rPr>
+                <w:sz w:val="20"/>
+              </w:rPr>
+            </w:r>
+            <w:r>
+              <w:rPr>
+                <w:sz w:val="20"/>
+              </w:rPr>
+              <w:t>Y2 Q2</w:t>
+            </w:r>
+          </w:p>
+        </w:tc>
+        <w:tc>
+          <w:tcPr>
+            <w:tcW w:type="dxa" w:w="1728"/>
+          </w:tcPr>
+          <w:p>
+            <w:r>
+              <w:rPr>
+                <w:sz w:val="20"/>
+              </w:rPr>
+            </w:r>
+            <w:r>
+              <w:rPr>
+                <w:sz w:val="20"/>
+              </w:rPr>
+              <w:t>300</w:t>
+            </w:r>
+          </w:p>
+        </w:tc>
+        <w:tc>
+          <w:tcPr>
+            <w:tcW w:type="dxa" w:w="1728"/>
+          </w:tcPr>
+          <w:p>
+            <w:r>
+              <w:rPr>
+                <w:sz w:val="20"/>
+              </w:rPr>
+            </w:r>
+            <w:r>
+              <w:rPr>
+                <w:sz w:val="20"/>
+              </w:rPr>
+              <w:t>440</w:t>
+            </w:r>
+          </w:p>
+        </w:tc>
+        <w:tc>
+          <w:tcPr>
+            <w:tcW w:type="dxa" w:w="1728"/>
+          </w:tcPr>
+          <w:p>
+            <w:r>
+              <w:rPr>
+                <w:sz w:val="20"/>
+              </w:rPr>
+            </w:r>
+            <w:r>
+              <w:rPr>
+                <w:sz w:val="20"/>
+              </w:rPr>
+              <w:t>(140)</w:t>
+            </w:r>
+          </w:p>
+        </w:tc>
+        <w:tc>
+          <w:tcPr>
+            <w:tcW w:type="dxa" w:w="1728"/>
+          </w:tcPr>
+          <w:p>
+            <w:r>
+              <w:rPr>
+                <w:sz w:val="20"/>
+              </w:rPr>
+            </w:r>
+            <w:r>
+              <w:rPr>
+                <w:sz w:val="20"/>
+              </w:rPr>
+              <w:t>(350)</w:t>
+            </w:r>
+          </w:p>
+        </w:tc>
+      </w:tr>
+      <w:tr>
+        <w:tc>
+          <w:tcPr>
+            <w:tcW w:type="dxa" w:w="1728"/>
+          </w:tcPr>
+          <w:p>
+            <w:r>
+              <w:rPr>
+                <w:sz w:val="20"/>
+              </w:rPr>
+            </w:r>
+            <w:r>
+              <w:rPr>
+                <w:sz w:val="20"/>
+              </w:rPr>
+              <w:t>Y2 Q3</w:t>
+            </w:r>
+          </w:p>
+        </w:tc>
+        <w:tc>
+          <w:tcPr>
+            <w:tcW w:type="dxa" w:w="1728"/>
+          </w:tcPr>
+          <w:p>
+            <w:r>
+              <w:rPr>
+                <w:sz w:val="20"/>
+              </w:rPr>
+            </w:r>
+            <w:r>
+              <w:rPr>
+                <w:sz w:val="20"/>
+              </w:rPr>
+              <w:t>350</w:t>
+            </w:r>
+          </w:p>
+        </w:tc>
+        <w:tc>
+          <w:tcPr>
+            <w:tcW w:type="dxa" w:w="1728"/>
+          </w:tcPr>
+          <w:p>
+            <w:r>
+              <w:rPr>
+                <w:sz w:val="20"/>
+              </w:rPr>
+            </w:r>
+            <w:r>
+              <w:rPr>
+                <w:sz w:val="20"/>
+              </w:rPr>
+              <w:t>430</w:t>
+            </w:r>
+          </w:p>
+        </w:tc>
+        <w:tc>
+          <w:tcPr>
+            <w:tcW w:type="dxa" w:w="1728"/>
+          </w:tcPr>
+          <w:p>
+            <w:r>
+              <w:rPr>
+                <w:sz w:val="20"/>
+              </w:rPr>
+            </w:r>
+            <w:r>
+              <w:rPr>
+                <w:sz w:val="20"/>
+              </w:rPr>
+              <w:t>(80)</w:t>
+            </w:r>
+          </w:p>
+        </w:tc>
+        <w:tc>
+          <w:tcPr>
+            <w:tcW w:type="dxa" w:w="1728"/>
+          </w:tcPr>
+          <w:p>
+            <w:r>
+              <w:rPr>
+                <w:sz w:val="20"/>
+              </w:rPr>
+            </w:r>
+            <w:r>
+              <w:rPr>
+                <w:sz w:val="20"/>
+              </w:rPr>
+              <w:t>(430)</w:t>
+            </w:r>
+          </w:p>
+        </w:tc>
+      </w:tr>
+      <w:tr>
+        <w:tc>
+          <w:tcPr>
+            <w:tcW w:type="dxa" w:w="1728"/>
+          </w:tcPr>
+          <w:p>
+            <w:r>
+              <w:rPr>
+                <w:sz w:val="20"/>
+              </w:rPr>
+            </w:r>
+            <w:r>
+              <w:rPr>
+                <w:sz w:val="20"/>
+              </w:rPr>
+              <w:t>Y2 Q4</w:t>
+            </w:r>
+          </w:p>
+        </w:tc>
+        <w:tc>
+          <w:tcPr>
+            <w:tcW w:type="dxa" w:w="1728"/>
+          </w:tcPr>
+          <w:p>
+            <w:r>
+              <w:rPr>
+                <w:sz w:val="20"/>
+              </w:rPr>
+            </w:r>
+            <w:r>
+              <w:rPr>
+                <w:sz w:val="20"/>
+              </w:rPr>
+              <w:t>400</w:t>
+            </w:r>
+          </w:p>
+        </w:tc>
+        <w:tc>
+          <w:tcPr>
+            <w:tcW w:type="dxa" w:w="1728"/>
+          </w:tcPr>
+          <w:p>
+            <w:r>
+              <w:rPr>
+                <w:sz w:val="20"/>
+              </w:rPr>
+            </w:r>
+            <w:r>
+              <w:rPr>
+                <w:sz w:val="20"/>
+              </w:rPr>
+              <w:t>420</w:t>
+            </w:r>
+          </w:p>
+        </w:tc>
+        <w:tc>
+          <w:tcPr>
+            <w:tcW w:type="dxa" w:w="1728"/>
+          </w:tcPr>
+          <w:p>
+            <w:r>
+              <w:rPr>
+                <w:sz w:val="20"/>
+              </w:rPr>
+            </w:r>
+            <w:r>
+              <w:rPr>
+                <w:sz w:val="20"/>
+              </w:rPr>
+              <w:t>(20)</w:t>
+            </w:r>
+          </w:p>
+        </w:tc>
+        <w:tc>
+          <w:tcPr>
+            <w:tcW w:type="dxa" w:w="1728"/>
+          </w:tcPr>
+          <w:p>
+            <w:r>
+              <w:rPr>
+                <w:sz w:val="20"/>
+              </w:rPr>
+            </w:r>
+            <w:r>
+              <w:rPr>
+                <w:sz w:val="20"/>
+              </w:rPr>
+              <w:t>(450)</w:t>
+            </w:r>
+          </w:p>
+        </w:tc>
+      </w:tr>
+      <w:tr>
+        <w:tc>
+          <w:tcPr>
+            <w:tcW w:type="dxa" w:w="1728"/>
+          </w:tcPr>
+          <w:p>
+            <w:r>
+              <w:rPr>
+                <w:sz w:val="20"/>
+              </w:rPr>
+            </w:r>
+            <w:r>
+              <w:rPr>
+                <w:sz w:val="20"/>
+              </w:rPr>
+              <w:t>Y3 Q1</w:t>
+            </w:r>
+          </w:p>
+        </w:tc>
+        <w:tc>
+          <w:tcPr>
+            <w:tcW w:type="dxa" w:w="1728"/>
+          </w:tcPr>
+          <w:p>
+            <w:r>
+              <w:rPr>
+                <w:sz w:val="20"/>
+              </w:rPr>
+            </w:r>
+            <w:r>
+              <w:rPr>
+                <w:sz w:val="20"/>
+              </w:rPr>
+              <w:t>650</w:t>
+            </w:r>
+          </w:p>
+        </w:tc>
+        <w:tc>
+          <w:tcPr>
+            <w:tcW w:type="dxa" w:w="1728"/>
+          </w:tcPr>
+          <w:p>
+            <w:r>
+              <w:rPr>
+                <w:sz w:val="20"/>
+              </w:rPr>
+            </w:r>
+            <w:r>
+              <w:rPr>
+                <w:sz w:val="20"/>
+              </w:rPr>
+              <w:t>780</w:t>
+            </w:r>
+          </w:p>
+        </w:tc>
+        <w:tc>
+          <w:tcPr>
+            <w:tcW w:type="dxa" w:w="1728"/>
+          </w:tcPr>
+          <w:p>
+            <w:r>
+              <w:rPr>
+                <w:sz w:val="20"/>
+              </w:rPr>
+            </w:r>
+            <w:r>
+              <w:rPr>
+                <w:sz w:val="20"/>
+              </w:rPr>
+              <w:t>(130)</w:t>
+            </w:r>
+          </w:p>
+        </w:tc>
+        <w:tc>
+          <w:tcPr>
+            <w:tcW w:type="dxa" w:w="1728"/>
+          </w:tcPr>
+          <w:p>
+            <w:r>
+              <w:rPr>
+                <w:sz w:val="20"/>
+              </w:rPr>
+            </w:r>
+            <w:r>
+              <w:rPr>
+                <w:sz w:val="20"/>
+              </w:rPr>
+              <w:t>(580)</w:t>
+            </w:r>
+          </w:p>
+        </w:tc>
+      </w:tr>
+      <w:tr>
+        <w:tc>
+          <w:tcPr>
+            <w:tcW w:type="dxa" w:w="1728"/>
+          </w:tcPr>
+          <w:p>
+            <w:r>
+              <w:rPr>
+                <w:sz w:val="20"/>
+              </w:rPr>
+            </w:r>
+            <w:r>
+              <w:rPr>
+                <w:sz w:val="20"/>
+              </w:rPr>
+              <w:t>Y3 Q2</w:t>
+            </w:r>
+          </w:p>
+        </w:tc>
+        <w:tc>
+          <w:tcPr>
+            <w:tcW w:type="dxa" w:w="1728"/>
+          </w:tcPr>
+          <w:p>
+            <w:r>
+              <w:rPr>
+                <w:sz w:val="20"/>
+              </w:rPr>
+            </w:r>
+            <w:r>
+              <w:rPr>
+                <w:sz w:val="20"/>
+              </w:rPr>
+              <w:t>740</w:t>
+            </w:r>
+          </w:p>
+        </w:tc>
+        <w:tc>
+          <w:tcPr>
+            <w:tcW w:type="dxa" w:w="1728"/>
+          </w:tcPr>
+          <w:p>
+            <w:r>
+              <w:rPr>
+                <w:sz w:val="20"/>
+              </w:rPr>
+            </w:r>
+            <w:r>
+              <w:rPr>
+                <w:sz w:val="20"/>
+              </w:rPr>
+              <w:t>760</w:t>
+            </w:r>
+          </w:p>
+        </w:tc>
+        <w:tc>
+          <w:tcPr>
+            <w:tcW w:type="dxa" w:w="1728"/>
+          </w:tcPr>
+          <w:p>
+            <w:r>
+              <w:rPr>
+                <w:sz w:val="20"/>
+              </w:rPr>
+            </w:r>
+            <w:r>
+              <w:rPr>
+                <w:sz w:val="20"/>
+              </w:rPr>
+              <w:t>(20)</w:t>
+            </w:r>
+          </w:p>
+        </w:tc>
+        <w:tc>
+          <w:tcPr>
+            <w:tcW w:type="dxa" w:w="1728"/>
+          </w:tcPr>
+          <w:p>
+            <w:r>
+              <w:rPr>
+                <w:sz w:val="20"/>
+              </w:rPr>
+            </w:r>
+            <w:r>
+              <w:rPr>
+                <w:sz w:val="20"/>
+              </w:rPr>
+              <w:t>(600)</w:t>
+            </w:r>
+          </w:p>
+        </w:tc>
+      </w:tr>
+      <w:tr>
+        <w:tc>
+          <w:tcPr>
+            <w:tcW w:type="dxa" w:w="1728"/>
+          </w:tcPr>
+          <w:p>
+            <w:r>
+              <w:rPr>
+                <w:sz w:val="20"/>
+              </w:rPr>
+            </w:r>
+            <w:r>
+              <w:rPr>
+                <w:sz w:val="20"/>
+              </w:rPr>
+              <w:t>Y3 Q3</w:t>
+            </w:r>
+          </w:p>
+        </w:tc>
+        <w:tc>
+          <w:tcPr>
+            <w:tcW w:type="dxa" w:w="1728"/>
+          </w:tcPr>
+          <w:p>
+            <w:r>
+              <w:rPr>
+                <w:sz w:val="20"/>
+              </w:rPr>
+            </w:r>
+            <w:r>
+              <w:rPr>
+                <w:sz w:val="20"/>
+              </w:rPr>
+              <w:t>820</w:t>
+            </w:r>
+          </w:p>
+        </w:tc>
+        <w:tc>
+          <w:tcPr>
+            <w:tcW w:type="dxa" w:w="1728"/>
+          </w:tcPr>
+          <w:p>
+            <w:r>
+              <w:rPr>
+                <w:sz w:val="20"/>
+              </w:rPr>
+            </w:r>
+            <w:r>
+              <w:rPr>
+                <w:sz w:val="20"/>
+              </w:rPr>
+              <w:t>740</w:t>
+            </w:r>
+          </w:p>
+        </w:tc>
+        <w:tc>
+          <w:tcPr>
+            <w:tcW w:type="dxa" w:w="1728"/>
+          </w:tcPr>
+          <w:p>
+            <w:r>
+              <w:rPr>
+                <w:sz w:val="20"/>
+              </w:rPr>
+            </w:r>
+            <w:r>
+              <w:rPr>
+                <w:sz w:val="20"/>
+              </w:rPr>
+              <w:t>80</w:t>
+            </w:r>
+          </w:p>
+        </w:tc>
+        <w:tc>
+          <w:tcPr>
+            <w:tcW w:type="dxa" w:w="1728"/>
+          </w:tcPr>
+          <w:p>
+            <w:r>
+              <w:rPr>
+                <w:sz w:val="20"/>
+              </w:rPr>
+            </w:r>
+            <w:r>
+              <w:rPr>
+                <w:sz w:val="20"/>
+              </w:rPr>
+              <w:t>(520)</w:t>
+            </w:r>
+          </w:p>
+        </w:tc>
+      </w:tr>
+      <w:tr>
+        <w:tc>
+          <w:tcPr>
+            <w:tcW w:type="dxa" w:w="1728"/>
+          </w:tcPr>
+          <w:p>
+            <w:r>
+              <w:rPr>
+                <w:sz w:val="20"/>
+              </w:rPr>
+            </w:r>
+            <w:r>
+              <w:rPr>
+                <w:sz w:val="20"/>
+              </w:rPr>
+              <w:t>Y3 Q4</w:t>
+            </w:r>
+          </w:p>
+        </w:tc>
+        <w:tc>
+          <w:tcPr>
+            <w:tcW w:type="dxa" w:w="1728"/>
+          </w:tcPr>
+          <w:p>
+            <w:r>
+              <w:rPr>
+                <w:sz w:val="20"/>
+              </w:rPr>
+            </w:r>
+            <w:r>
+              <w:rPr>
+                <w:sz w:val="20"/>
+              </w:rPr>
+              <w:t>890</w:t>
+            </w:r>
+          </w:p>
+        </w:tc>
+        <w:tc>
+          <w:tcPr>
+            <w:tcW w:type="dxa" w:w="1728"/>
+          </w:tcPr>
+          <w:p>
+            <w:r>
+              <w:rPr>
+                <w:sz w:val="20"/>
+              </w:rPr>
+            </w:r>
+            <w:r>
+              <w:rPr>
+                <w:sz w:val="20"/>
+              </w:rPr>
+              <w:t>720</w:t>
+            </w:r>
+          </w:p>
+        </w:tc>
+        <w:tc>
+          <w:tcPr>
+            <w:tcW w:type="dxa" w:w="1728"/>
+          </w:tcPr>
+          <w:p>
+            <w:r>
+              <w:rPr>
+                <w:sz w:val="20"/>
+              </w:rPr>
+            </w:r>
+            <w:r>
+              <w:rPr>
+                <w:sz w:val="20"/>
+              </w:rPr>
+              <w:t>170</w:t>
+            </w:r>
+          </w:p>
+        </w:tc>
+        <w:tc>
+          <w:tcPr>
+            <w:tcW w:type="dxa" w:w="1728"/>
+          </w:tcPr>
+          <w:p>
+            <w:r>
+              <w:rPr>
+                <w:sz w:val="20"/>
+              </w:rPr>
+            </w:r>
+            <w:r>
+              <w:rPr>
+                <w:sz w:val="20"/>
+              </w:rPr>
+              <w:t>(350)</w:t>
+            </w:r>
+          </w:p>
+        </w:tc>
+      </w:tr>
+    </w:tbl>
+    <w:p>
+      <w:r>
+        <w:t xml:space="preserve">PoC crosses to </w:t>
+      </w:r>
+      <w:r>
+        <w:rPr>
+          <w:b/>
+        </w:rPr>
+        <w:t>quarter-positive in Y3 Q3</w:t>
+      </w:r>
+      <w:r>
+        <w:t xml:space="preserve"> and finishes Year 3 at a positive run-rate.</w:t>
+      </w:r>
+    </w:p>
+    <w:p>
+      <w:r>
+        <w:rPr>
+          <w:b/>
+        </w:rPr>
+        <w:t>(d) Consolidated funding &amp; crossover (test + 3-year).</w:t>
+      </w:r>
+    </w:p>
+    <w:tbl>
+      <w:tblPr>
+        <w:tblStyle w:val="TableGrid"/>
+        <w:tblW w:type="auto" w:w="0"/>
+        <w:tblLayout w:type="autofit"/>
+        <w:tblLook w:firstColumn="1" w:firstRow="1" w:lastColumn="0" w:lastRow="0" w:noHBand="0" w:noVBand="1" w:val="04A0"/>
+      </w:tblPr>
+      <w:tblGrid>
+        <w:gridCol w:w="1728"/>
+        <w:gridCol w:w="1728"/>
+        <w:gridCol w:w="1728"/>
+        <w:gridCol w:w="1728"/>
+        <w:gridCol w:w="1728"/>
+      </w:tblGrid>
+      <w:tr>
+        <w:tc>
+          <w:tcPr>
+            <w:tcW w:type="dxa" w:w="1728"/>
+            <w:shd w:val="clear" w:fill="DBE5F1"/>
+          </w:tcPr>
+          <w:p>
+            <w:r>
+              <w:rPr>
+                <w:b/>
+                <w:sz w:val="20"/>
+              </w:rPr>
+            </w:r>
+            <w:r>
+              <w:rPr>
+                <w:b/>
+                <w:sz w:val="20"/>
+              </w:rPr>
+              <w:t>($000)</w:t>
+            </w:r>
+          </w:p>
+        </w:tc>
+        <w:tc>
+          <w:tcPr>
+            <w:tcW w:type="dxa" w:w="1728"/>
+            <w:shd w:val="clear" w:fill="DBE5F1"/>
+          </w:tcPr>
+          <w:p>
+            <w:r>
+              <w:rPr>
+                <w:b/>
+                <w:sz w:val="20"/>
+              </w:rPr>
+            </w:r>
+            <w:r>
+              <w:rPr>
+                <w:b/>
+                <w:sz w:val="20"/>
+              </w:rPr>
+              <w:t>Test (Yr 0)</w:t>
+            </w:r>
+          </w:p>
+        </w:tc>
+        <w:tc>
+          <w:tcPr>
+            <w:tcW w:type="dxa" w:w="1728"/>
+            <w:shd w:val="clear" w:fill="DBE5F1"/>
+          </w:tcPr>
+          <w:p>
+            <w:r>
+              <w:rPr>
+                <w:b/>
+                <w:sz w:val="20"/>
+              </w:rPr>
+            </w:r>
+            <w:r>
+              <w:rPr>
+                <w:b/>
+                <w:sz w:val="20"/>
+              </w:rPr>
+              <w:t>Year 1</w:t>
+            </w:r>
+          </w:p>
+        </w:tc>
+        <w:tc>
+          <w:tcPr>
+            <w:tcW w:type="dxa" w:w="1728"/>
+            <w:shd w:val="clear" w:fill="DBE5F1"/>
+          </w:tcPr>
+          <w:p>
+            <w:r>
+              <w:rPr>
+                <w:b/>
+                <w:sz w:val="20"/>
+              </w:rPr>
+            </w:r>
+            <w:r>
+              <w:rPr>
+                <w:b/>
+                <w:sz w:val="20"/>
+              </w:rPr>
+              <w:t>Year 2</w:t>
+            </w:r>
+          </w:p>
+        </w:tc>
+        <w:tc>
+          <w:tcPr>
+            <w:tcW w:type="dxa" w:w="1728"/>
+            <w:shd w:val="clear" w:fill="DBE5F1"/>
+          </w:tcPr>
+          <w:p>
+            <w:r>
+              <w:rPr>
+                <w:b/>
+                <w:sz w:val="20"/>
+              </w:rPr>
+            </w:r>
+            <w:r>
+              <w:rPr>
+                <w:b/>
+                <w:sz w:val="20"/>
+              </w:rPr>
+              <w:t>Year 3</w:t>
+            </w:r>
+          </w:p>
+        </w:tc>
+      </w:tr>
+      <w:tr>
+        <w:tc>
+          <w:tcPr>
+            <w:tcW w:type="dxa" w:w="1728"/>
+          </w:tcPr>
+          <w:p>
+            <w:r>
+              <w:rPr>
+                <w:sz w:val="20"/>
+              </w:rPr>
+            </w:r>
+            <w:r>
+              <w:rPr>
+                <w:sz w:val="20"/>
+              </w:rPr>
+              <w:t>Beginning cash</w:t>
+            </w:r>
+          </w:p>
+        </w:tc>
+        <w:tc>
+          <w:tcPr>
+            <w:tcW w:type="dxa" w:w="1728"/>
+          </w:tcPr>
+          <w:p>
+            <w:r>
+              <w:rPr>
+                <w:sz w:val="20"/>
+              </w:rPr>
+            </w:r>
+            <w:r>
+              <w:rPr>
+                <w:sz w:val="20"/>
+              </w:rPr>
+              <w:t>0</w:t>
+            </w:r>
+          </w:p>
+        </w:tc>
+        <w:tc>
+          <w:tcPr>
+            <w:tcW w:type="dxa" w:w="1728"/>
+          </w:tcPr>
+          <w:p>
+            <w:r>
+              <w:rPr>
+                <w:sz w:val="20"/>
+              </w:rPr>
+            </w:r>
+            <w:r>
+              <w:rPr>
+                <w:sz w:val="20"/>
+              </w:rPr>
+              <w:t>30</w:t>
+            </w:r>
+          </w:p>
+        </w:tc>
+        <w:tc>
+          <w:tcPr>
+            <w:tcW w:type="dxa" w:w="1728"/>
+          </w:tcPr>
+          <w:p>
+            <w:r>
+              <w:rPr>
+                <w:sz w:val="20"/>
+              </w:rPr>
+            </w:r>
+            <w:r>
+              <w:rPr>
+                <w:sz w:val="20"/>
+              </w:rPr>
+              <w:t>40</w:t>
+            </w:r>
+          </w:p>
+        </w:tc>
+        <w:tc>
+          <w:tcPr>
+            <w:tcW w:type="dxa" w:w="1728"/>
+          </w:tcPr>
+          <w:p>
+            <w:r>
+              <w:rPr>
+                <w:sz w:val="20"/>
+              </w:rPr>
+            </w:r>
+            <w:r>
+              <w:rPr>
+                <w:sz w:val="20"/>
+              </w:rPr>
+              <w:t>50</w:t>
+            </w:r>
+          </w:p>
+        </w:tc>
+      </w:tr>
+      <w:tr>
+        <w:tc>
+          <w:tcPr>
+            <w:tcW w:type="dxa" w:w="1728"/>
+          </w:tcPr>
+          <w:p>
+            <w:r>
+              <w:rPr>
+                <w:sz w:val="20"/>
+              </w:rPr>
+            </w:r>
+            <w:r>
+              <w:rPr>
+                <w:sz w:val="20"/>
+              </w:rPr>
+              <w:t>Capital contribution (PoC share)</w:t>
+            </w:r>
+          </w:p>
+        </w:tc>
+        <w:tc>
+          <w:tcPr>
+            <w:tcW w:type="dxa" w:w="1728"/>
+          </w:tcPr>
+          <w:p>
+            <w:r>
+              <w:rPr>
+                <w:sz w:val="20"/>
+              </w:rPr>
+            </w:r>
+            <w:r>
+              <w:rPr>
+                <w:sz w:val="20"/>
+              </w:rPr>
+              <w:t>230</w:t>
+            </w:r>
+          </w:p>
+        </w:tc>
+        <w:tc>
+          <w:tcPr>
+            <w:tcW w:type="dxa" w:w="1728"/>
+          </w:tcPr>
+          <w:p>
+            <w:r>
+              <w:rPr>
+                <w:sz w:val="20"/>
+              </w:rPr>
+            </w:r>
+            <w:r>
+              <w:rPr>
+                <w:sz w:val="20"/>
+              </w:rPr>
+              <w:t>410</w:t>
+            </w:r>
+          </w:p>
+        </w:tc>
+        <w:tc>
+          <w:tcPr>
+            <w:tcW w:type="dxa" w:w="1728"/>
+          </w:tcPr>
+          <w:p>
+            <w:r>
+              <w:rPr>
+                <w:sz w:val="20"/>
+              </w:rPr>
+            </w:r>
+            <w:r>
+              <w:rPr>
+                <w:sz w:val="20"/>
+              </w:rPr>
+              <w:t>460</w:t>
+            </w:r>
+          </w:p>
+        </w:tc>
+        <w:tc>
+          <w:tcPr>
+            <w:tcW w:type="dxa" w:w="1728"/>
+          </w:tcPr>
+          <w:p>
+            <w:r>
+              <w:rPr>
+                <w:sz w:val="20"/>
+              </w:rPr>
+            </w:r>
+            <w:r>
+              <w:rPr>
+                <w:sz w:val="20"/>
+              </w:rPr>
+              <w:t>0</w:t>
+            </w:r>
+          </w:p>
+        </w:tc>
+      </w:tr>
+      <w:tr>
+        <w:tc>
+          <w:tcPr>
+            <w:tcW w:type="dxa" w:w="1728"/>
+          </w:tcPr>
+          <w:p>
+            <w:r>
+              <w:rPr>
+                <w:sz w:val="20"/>
+              </w:rPr>
+            </w:r>
+            <w:r>
+              <w:rPr>
+                <w:sz w:val="20"/>
+              </w:rPr>
+              <w:t>Operating cash flow</w:t>
+            </w:r>
+          </w:p>
+        </w:tc>
+        <w:tc>
+          <w:tcPr>
+            <w:tcW w:type="dxa" w:w="1728"/>
+          </w:tcPr>
+          <w:p>
+            <w:r>
+              <w:rPr>
+                <w:sz w:val="20"/>
+              </w:rPr>
+            </w:r>
+            <w:r>
+              <w:rPr>
+                <w:sz w:val="20"/>
+              </w:rPr>
+              <w:t>(200)</w:t>
+            </w:r>
+          </w:p>
+        </w:tc>
+        <w:tc>
+          <w:tcPr>
+            <w:tcW w:type="dxa" w:w="1728"/>
+          </w:tcPr>
+          <w:p>
+            <w:r>
+              <w:rPr>
+                <w:sz w:val="20"/>
+              </w:rPr>
+            </w:r>
+            <w:r>
+              <w:rPr>
+                <w:sz w:val="20"/>
+              </w:rPr>
+              <w:t>(400)</w:t>
+            </w:r>
+          </w:p>
+        </w:tc>
+        <w:tc>
+          <w:tcPr>
+            <w:tcW w:type="dxa" w:w="1728"/>
+          </w:tcPr>
+          <w:p>
+            <w:r>
+              <w:rPr>
+                <w:sz w:val="20"/>
+              </w:rPr>
+            </w:r>
+            <w:r>
+              <w:rPr>
+                <w:sz w:val="20"/>
+              </w:rPr>
+              <w:t>(450)</w:t>
+            </w:r>
+          </w:p>
+        </w:tc>
+        <w:tc>
+          <w:tcPr>
+            <w:tcW w:type="dxa" w:w="1728"/>
+          </w:tcPr>
+          <w:p>
+            <w:r>
+              <w:rPr>
+                <w:sz w:val="20"/>
+              </w:rPr>
+            </w:r>
+            <w:r>
+              <w:rPr>
+                <w:sz w:val="20"/>
+              </w:rPr>
+              <w:t>100</w:t>
+            </w:r>
+          </w:p>
+        </w:tc>
+      </w:tr>
+      <w:tr>
+        <w:tc>
+          <w:tcPr>
+            <w:tcW w:type="dxa" w:w="1728"/>
+          </w:tcPr>
+          <w:p>
+            <w:r>
+              <w:rPr>
+                <w:sz w:val="20"/>
+              </w:rPr>
+            </w:r>
+            <w:r>
+              <w:rPr>
+                <w:b/>
+                <w:sz w:val="20"/>
+              </w:rPr>
+              <w:t>Ending cash</w:t>
+            </w:r>
+          </w:p>
+        </w:tc>
+        <w:tc>
+          <w:tcPr>
+            <w:tcW w:type="dxa" w:w="1728"/>
+          </w:tcPr>
+          <w:p>
+            <w:r>
+              <w:rPr>
+                <w:sz w:val="20"/>
+              </w:rPr>
+            </w:r>
+            <w:r>
+              <w:rPr>
+                <w:b/>
+                <w:sz w:val="20"/>
+              </w:rPr>
+              <w:t>30</w:t>
+            </w:r>
+          </w:p>
+        </w:tc>
+        <w:tc>
+          <w:tcPr>
+            <w:tcW w:type="dxa" w:w="1728"/>
+          </w:tcPr>
+          <w:p>
+            <w:r>
+              <w:rPr>
+                <w:sz w:val="20"/>
+              </w:rPr>
+            </w:r>
+            <w:r>
+              <w:rPr>
+                <w:b/>
+                <w:sz w:val="20"/>
+              </w:rPr>
+              <w:t>40</w:t>
+            </w:r>
+          </w:p>
+        </w:tc>
+        <w:tc>
+          <w:tcPr>
+            <w:tcW w:type="dxa" w:w="1728"/>
+          </w:tcPr>
+          <w:p>
+            <w:r>
+              <w:rPr>
+                <w:sz w:val="20"/>
+              </w:rPr>
+            </w:r>
+            <w:r>
+              <w:rPr>
+                <w:b/>
+                <w:sz w:val="20"/>
+              </w:rPr>
+              <w:t>50</w:t>
+            </w:r>
+          </w:p>
+        </w:tc>
+        <w:tc>
+          <w:tcPr>
+            <w:tcW w:type="dxa" w:w="1728"/>
+          </w:tcPr>
+          <w:p>
+            <w:r>
+              <w:rPr>
+                <w:sz w:val="20"/>
+              </w:rPr>
+            </w:r>
+            <w:r>
+              <w:rPr>
+                <w:b/>
+                <w:sz w:val="20"/>
+              </w:rPr>
+              <w:t>150</w:t>
+            </w:r>
+          </w:p>
+        </w:tc>
+      </w:tr>
+      <w:tr>
+        <w:tc>
+          <w:tcPr>
+            <w:tcW w:type="dxa" w:w="1728"/>
+          </w:tcPr>
+          <w:p>
+            <w:r>
+              <w:rPr>
+                <w:sz w:val="20"/>
+              </w:rPr>
+            </w:r>
+            <w:r>
+              <w:rPr>
+                <w:b/>
+                <w:sz w:val="20"/>
+              </w:rPr>
+              <w:t>Cumulative capital drawn</w:t>
+            </w:r>
+          </w:p>
+        </w:tc>
+        <w:tc>
+          <w:tcPr>
+            <w:tcW w:type="dxa" w:w="1728"/>
+          </w:tcPr>
+          <w:p>
+            <w:r>
+              <w:rPr>
+                <w:sz w:val="20"/>
+              </w:rPr>
+            </w:r>
+            <w:r>
+              <w:rPr>
+                <w:sz w:val="20"/>
+              </w:rPr>
+              <w:t>230</w:t>
+            </w:r>
+          </w:p>
+        </w:tc>
+        <w:tc>
+          <w:tcPr>
+            <w:tcW w:type="dxa" w:w="1728"/>
+          </w:tcPr>
+          <w:p>
+            <w:r>
+              <w:rPr>
+                <w:sz w:val="20"/>
+              </w:rPr>
+            </w:r>
+            <w:r>
+              <w:rPr>
+                <w:sz w:val="20"/>
+              </w:rPr>
+              <w:t>640</w:t>
+            </w:r>
+          </w:p>
+        </w:tc>
+        <w:tc>
+          <w:tcPr>
+            <w:tcW w:type="dxa" w:w="1728"/>
+          </w:tcPr>
+          <w:p>
+            <w:r>
+              <w:rPr>
+                <w:sz w:val="20"/>
+              </w:rPr>
+            </w:r>
+            <w:r>
+              <w:rPr>
+                <w:sz w:val="20"/>
+              </w:rPr>
+              <w:t>1,100</w:t>
+            </w:r>
+          </w:p>
+        </w:tc>
+        <w:tc>
+          <w:tcPr>
+            <w:tcW w:type="dxa" w:w="1728"/>
+          </w:tcPr>
+          <w:p>
+            <w:r>
+              <w:rPr>
+                <w:sz w:val="20"/>
+              </w:rPr>
+            </w:r>
+            <w:r>
+              <w:rPr>
+                <w:sz w:val="20"/>
+              </w:rPr>
+              <w:t>1,100</w:t>
+            </w:r>
+          </w:p>
+        </w:tc>
+      </w:tr>
+    </w:tbl>
+    <w:p>
+      <w:pPr>
+        <w:pStyle w:val="ListBullet"/>
+      </w:pPr>
+      <w:r>
+        <w:rPr>
+          <w:b/>
+        </w:rPr>
+        <w:t>Peak cumulative capital ≈ $1.1M</w:t>
+      </w:r>
+      <w:r>
+        <w:t xml:space="preserve"> (end of Year 2), then PoC self-funds — consistent with the ~$1.0–1.2M PoC investment cited in §9.2, </w:t>
+      </w:r>
+      <w:r>
+        <w:rPr>
+          <w:b/>
+        </w:rPr>
+        <w:t>within</w:t>
+      </w:r>
+      <w:r>
+        <w:t xml:space="preserve"> the Ventures ~$3.0M envelope.</w:t>
+      </w:r>
+    </w:p>
+    <w:p>
+      <w:pPr>
+        <w:pStyle w:val="ListBullet"/>
+      </w:pPr>
+      <w:r>
+        <w:rPr>
+          <w:b/>
+        </w:rPr>
+        <w:t>No PoC capital draw in Year 3</w:t>
+      </w:r>
+      <w:r>
+        <w:t xml:space="preserve"> (operations cover costs); first cash to APPA (royalty/dividend) flows at the Ventures level from Year 4 (§C/§D).</w:t>
+      </w:r>
+    </w:p>
+    <w:p>
+      <w:pPr>
+        <w:pStyle w:val="ListBullet"/>
+      </w:pPr>
+      <w:r>
+        <w:t xml:space="preserve">North-Star pursuit (§9.4) replaces this schedule with a steeper ramp requiring </w:t>
+      </w:r>
+      <w:r>
+        <w:rPr>
+          <w:b/>
+        </w:rPr>
+        <w:t>~$8–12M</w:t>
+      </w:r>
+      <w:r>
+        <w:t xml:space="preserve"> growth capital and peak cumulative burn through Years 3–4.</w:t>
       </w:r>
     </w:p>
     <w:p>

</xml_diff>

<commit_message>
Add eventual national expansion schedule (10 regions / 100 markets / 2M subs)
Add the full national footprint to the business plan and city-selection doc:
10 regions x 10 markets x ~20K subs = ~2.0M subscribers (~200K/region), with
an illustrative right-size market set per region (SE, Midwest, Texas, Southwest,
Florida, Pacific NW, Mid-Atlantic, Upper Midwest, Northeast, California) and a
region-by-region launch sequence (~2 regions/yr after Yr 4; ~8-10yr horizon;
mega-metros excluded as local editions).

Add S 9.8 terminal-state economics: ~2M subs x ~$45 ARPU = ~$70-110M revenue,
~$25-33M EBITDA, ~$300-450M EV (PoC alone), with the 3-yr base case and 5-yr
North-Star (50 markets) as waypoints en route. Regenerated Word export.

Co-Authored-By: Claude Opus 4.8 (1M context) <noreply@anthropic.com>
Claude-Session: https://claude.ai/code/session_016gWMtWeutWcnpqhZxT7WHC
</commit_message>
<xml_diff>
--- a/PoC-Business-Plan.docx
+++ b/PoC-Business-Plan.docx
@@ -4827,6 +4827,758 @@
       </w:r>
     </w:p>
     <w:p>
+      <w:pPr>
+        <w:pStyle w:val="Heading3"/>
+      </w:pPr>
+      <w:r>
+        <w:rPr>
+          <w:color w:val="2E5496"/>
+        </w:rPr>
+        <w:t>8.4 Eventual national footprint — 10 regions × 10 markets (2M subscribers)</w:t>
+      </w:r>
+    </w:p>
+    <w:p>
+      <w:r>
+        <w:t xml:space="preserve">The terminal vision: </w:t>
+      </w:r>
+      <w:r>
+        <w:rPr>
+          <w:b/>
+        </w:rPr>
+        <w:t>10 regions × 10 markets × ~20,000 subscribers = 200,000 per region = ~2.0M opted-in pet owners nationally.</w:t>
+      </w:r>
+      <w:r>
+        <w:t xml:space="preserve"> Built region-by-region on the "win-a-region-then-replicate" playbook; every market screened by the right-size + pet-bought-in + vet-relationship + whitespace criteria, with </w:t>
+      </w:r>
+      <w:r>
+        <w:rPr>
+          <w:b/>
+        </w:rPr>
+        <w:t>combo editions</w:t>
+      </w:r>
+      <w:r>
+        <w:t xml:space="preserve"> for adjacent affluent suburbs.</w:t>
+      </w:r>
+    </w:p>
+    <w:tbl>
+      <w:tblPr>
+        <w:tblStyle w:val="TableGrid"/>
+        <w:tblW w:type="auto" w:w="0"/>
+        <w:tblLayout w:type="autofit"/>
+        <w:tblLook w:firstColumn="1" w:firstRow="1" w:lastColumn="0" w:lastRow="0" w:noHBand="0" w:noVBand="1" w:val="04A0"/>
+      </w:tblPr>
+      <w:tblGrid>
+        <w:gridCol w:w="2880"/>
+        <w:gridCol w:w="2880"/>
+        <w:gridCol w:w="2880"/>
+      </w:tblGrid>
+      <w:tr>
+        <w:tc>
+          <w:tcPr>
+            <w:tcW w:type="dxa" w:w="2880"/>
+            <w:shd w:val="clear" w:fill="DBE5F1"/>
+          </w:tcPr>
+          <w:p>
+            <w:r>
+              <w:rPr>
+                <w:b/>
+                <w:sz w:val="20"/>
+              </w:rPr>
+            </w:r>
+            <w:r>
+              <w:rPr>
+                <w:b/>
+                <w:sz w:val="20"/>
+              </w:rPr>
+              <w:t>Region</w:t>
+            </w:r>
+          </w:p>
+        </w:tc>
+        <w:tc>
+          <w:tcPr>
+            <w:tcW w:type="dxa" w:w="2880"/>
+            <w:shd w:val="clear" w:fill="DBE5F1"/>
+          </w:tcPr>
+          <w:p>
+            <w:r>
+              <w:rPr>
+                <w:b/>
+                <w:sz w:val="20"/>
+              </w:rPr>
+            </w:r>
+            <w:r>
+              <w:rPr>
+                <w:b/>
+                <w:sz w:val="20"/>
+              </w:rPr>
+              <w:t>Illustrative 10-market set (screened before commit)</w:t>
+            </w:r>
+          </w:p>
+        </w:tc>
+        <w:tc>
+          <w:tcPr>
+            <w:tcW w:type="dxa" w:w="2880"/>
+            <w:shd w:val="clear" w:fill="DBE5F1"/>
+          </w:tcPr>
+          <w:p>
+            <w:r>
+              <w:rPr>
+                <w:b/>
+                <w:sz w:val="20"/>
+              </w:rPr>
+            </w:r>
+            <w:r>
+              <w:rPr>
+                <w:b/>
+                <w:sz w:val="20"/>
+              </w:rPr>
+              <w:t>Launch window</w:t>
+            </w:r>
+          </w:p>
+        </w:tc>
+      </w:tr>
+      <w:tr>
+        <w:tc>
+          <w:tcPr>
+            <w:tcW w:type="dxa" w:w="2880"/>
+          </w:tcPr>
+          <w:p>
+            <w:r>
+              <w:rPr>
+                <w:sz w:val="20"/>
+              </w:rPr>
+            </w:r>
+            <w:r>
+              <w:rPr>
+                <w:b/>
+                <w:sz w:val="20"/>
+              </w:rPr>
+              <w:t>Southeast</w:t>
+            </w:r>
+          </w:p>
+        </w:tc>
+        <w:tc>
+          <w:tcPr>
+            <w:tcW w:type="dxa" w:w="2880"/>
+          </w:tcPr>
+          <w:p>
+            <w:r>
+              <w:rPr>
+                <w:sz w:val="20"/>
+              </w:rPr>
+            </w:r>
+            <w:r>
+              <w:rPr>
+                <w:sz w:val="20"/>
+              </w:rPr>
+              <w:t>Chattanooga (HQ), Brentwood/Franklin, Columbia SC, Raleigh, Asheville, Charleston, Greenville, Knoxville, Huntsville, Savannah</w:t>
+            </w:r>
+          </w:p>
+        </w:tc>
+        <w:tc>
+          <w:tcPr>
+            <w:tcW w:type="dxa" w:w="2880"/>
+          </w:tcPr>
+          <w:p>
+            <w:r>
+              <w:rPr>
+                <w:sz w:val="20"/>
+              </w:rPr>
+            </w:r>
+            <w:r>
+              <w:rPr>
+                <w:sz w:val="20"/>
+              </w:rPr>
+              <w:t>Yr 0–3</w:t>
+            </w:r>
+          </w:p>
+        </w:tc>
+      </w:tr>
+      <w:tr>
+        <w:tc>
+          <w:tcPr>
+            <w:tcW w:type="dxa" w:w="2880"/>
+          </w:tcPr>
+          <w:p>
+            <w:r>
+              <w:rPr>
+                <w:sz w:val="20"/>
+              </w:rPr>
+            </w:r>
+            <w:r>
+              <w:rPr>
+                <w:b/>
+                <w:sz w:val="20"/>
+              </w:rPr>
+              <w:t>Midwest</w:t>
+            </w:r>
+          </w:p>
+        </w:tc>
+        <w:tc>
+          <w:tcPr>
+            <w:tcW w:type="dxa" w:w="2880"/>
+          </w:tcPr>
+          <w:p>
+            <w:r>
+              <w:rPr>
+                <w:sz w:val="20"/>
+              </w:rPr>
+            </w:r>
+            <w:r>
+              <w:rPr>
+                <w:sz w:val="20"/>
+              </w:rPr>
+              <w:t>Kansas City, Omaha, Wichita, Lincoln, Des Moines, Springfield MO, Cedar Rapids, Fort Wayne, Dayton, Bloomington IN</w:t>
+            </w:r>
+          </w:p>
+        </w:tc>
+        <w:tc>
+          <w:tcPr>
+            <w:tcW w:type="dxa" w:w="2880"/>
+          </w:tcPr>
+          <w:p>
+            <w:r>
+              <w:rPr>
+                <w:sz w:val="20"/>
+              </w:rPr>
+            </w:r>
+            <w:r>
+              <w:rPr>
+                <w:sz w:val="20"/>
+              </w:rPr>
+              <w:t>Yr 2–4</w:t>
+            </w:r>
+          </w:p>
+        </w:tc>
+      </w:tr>
+      <w:tr>
+        <w:tc>
+          <w:tcPr>
+            <w:tcW w:type="dxa" w:w="2880"/>
+          </w:tcPr>
+          <w:p>
+            <w:r>
+              <w:rPr>
+                <w:sz w:val="20"/>
+              </w:rPr>
+            </w:r>
+            <w:r>
+              <w:rPr>
+                <w:b/>
+                <w:sz w:val="20"/>
+              </w:rPr>
+              <w:t>Texas</w:t>
+            </w:r>
+          </w:p>
+        </w:tc>
+        <w:tc>
+          <w:tcPr>
+            <w:tcW w:type="dxa" w:w="2880"/>
+          </w:tcPr>
+          <w:p>
+            <w:r>
+              <w:rPr>
+                <w:sz w:val="20"/>
+              </w:rPr>
+            </w:r>
+            <w:r>
+              <w:rPr>
+                <w:sz w:val="20"/>
+              </w:rPr>
+              <w:t>San Antonio, Waco, Austin, Fort Worth, New Braunfels/San Marcos, Lubbock, Amarillo, College Station, Corpus Christi, El Paso</w:t>
+            </w:r>
+          </w:p>
+        </w:tc>
+        <w:tc>
+          <w:tcPr>
+            <w:tcW w:type="dxa" w:w="2880"/>
+          </w:tcPr>
+          <w:p>
+            <w:r>
+              <w:rPr>
+                <w:sz w:val="20"/>
+              </w:rPr>
+            </w:r>
+            <w:r>
+              <w:rPr>
+                <w:sz w:val="20"/>
+              </w:rPr>
+              <w:t>Yr 2–4</w:t>
+            </w:r>
+          </w:p>
+        </w:tc>
+      </w:tr>
+      <w:tr>
+        <w:tc>
+          <w:tcPr>
+            <w:tcW w:type="dxa" w:w="2880"/>
+          </w:tcPr>
+          <w:p>
+            <w:r>
+              <w:rPr>
+                <w:sz w:val="20"/>
+              </w:rPr>
+            </w:r>
+            <w:r>
+              <w:rPr>
+                <w:b/>
+                <w:sz w:val="20"/>
+              </w:rPr>
+              <w:t>Southwest</w:t>
+            </w:r>
+          </w:p>
+        </w:tc>
+        <w:tc>
+          <w:tcPr>
+            <w:tcW w:type="dxa" w:w="2880"/>
+          </w:tcPr>
+          <w:p>
+            <w:r>
+              <w:rPr>
+                <w:sz w:val="20"/>
+              </w:rPr>
+            </w:r>
+            <w:r>
+              <w:rPr>
+                <w:sz w:val="20"/>
+              </w:rPr>
+              <w:t>Tucson, Albuquerque, Scottsdale/Tempe, Santa Fe, Colorado Springs, Fort Collins, Reno, Henderson, Boulder, St. George</w:t>
+            </w:r>
+          </w:p>
+        </w:tc>
+        <w:tc>
+          <w:tcPr>
+            <w:tcW w:type="dxa" w:w="2880"/>
+          </w:tcPr>
+          <w:p>
+            <w:r>
+              <w:rPr>
+                <w:sz w:val="20"/>
+              </w:rPr>
+            </w:r>
+            <w:r>
+              <w:rPr>
+                <w:sz w:val="20"/>
+              </w:rPr>
+              <w:t>Yr 4–6</w:t>
+            </w:r>
+          </w:p>
+        </w:tc>
+      </w:tr>
+      <w:tr>
+        <w:tc>
+          <w:tcPr>
+            <w:tcW w:type="dxa" w:w="2880"/>
+          </w:tcPr>
+          <w:p>
+            <w:r>
+              <w:rPr>
+                <w:sz w:val="20"/>
+              </w:rPr>
+            </w:r>
+            <w:r>
+              <w:rPr>
+                <w:b/>
+                <w:sz w:val="20"/>
+              </w:rPr>
+              <w:t>Florida</w:t>
+            </w:r>
+          </w:p>
+        </w:tc>
+        <w:tc>
+          <w:tcPr>
+            <w:tcW w:type="dxa" w:w="2880"/>
+          </w:tcPr>
+          <w:p>
+            <w:r>
+              <w:rPr>
+                <w:sz w:val="20"/>
+              </w:rPr>
+            </w:r>
+            <w:r>
+              <w:rPr>
+                <w:sz w:val="20"/>
+              </w:rPr>
+              <w:t>Sarasota, Naples, Fort Myers/Cape Coral, Daytona Beach, Lakeland, Gainesville, Tallahassee, Pensacola, Ocala, Port St. Lucie</w:t>
+            </w:r>
+          </w:p>
+        </w:tc>
+        <w:tc>
+          <w:tcPr>
+            <w:tcW w:type="dxa" w:w="2880"/>
+          </w:tcPr>
+          <w:p>
+            <w:r>
+              <w:rPr>
+                <w:sz w:val="20"/>
+              </w:rPr>
+            </w:r>
+            <w:r>
+              <w:rPr>
+                <w:sz w:val="20"/>
+              </w:rPr>
+              <w:t>Yr 4–6</w:t>
+            </w:r>
+          </w:p>
+        </w:tc>
+      </w:tr>
+      <w:tr>
+        <w:tc>
+          <w:tcPr>
+            <w:tcW w:type="dxa" w:w="2880"/>
+          </w:tcPr>
+          <w:p>
+            <w:r>
+              <w:rPr>
+                <w:sz w:val="20"/>
+              </w:rPr>
+            </w:r>
+            <w:r>
+              <w:rPr>
+                <w:b/>
+                <w:sz w:val="20"/>
+              </w:rPr>
+              <w:t>Pacific NW</w:t>
+            </w:r>
+          </w:p>
+        </w:tc>
+        <w:tc>
+          <w:tcPr>
+            <w:tcW w:type="dxa" w:w="2880"/>
+          </w:tcPr>
+          <w:p>
+            <w:r>
+              <w:rPr>
+                <w:sz w:val="20"/>
+              </w:rPr>
+            </w:r>
+            <w:r>
+              <w:rPr>
+                <w:sz w:val="20"/>
+              </w:rPr>
+              <w:t>Boise, Spokane, Tacoma, Vancouver WA, Bend, Eugene, Salem, Olympia, Bellingham, Coeur d'Alene</w:t>
+            </w:r>
+          </w:p>
+        </w:tc>
+        <w:tc>
+          <w:tcPr>
+            <w:tcW w:type="dxa" w:w="2880"/>
+          </w:tcPr>
+          <w:p>
+            <w:r>
+              <w:rPr>
+                <w:sz w:val="20"/>
+              </w:rPr>
+            </w:r>
+            <w:r>
+              <w:rPr>
+                <w:sz w:val="20"/>
+              </w:rPr>
+              <w:t>Yr 5–7</w:t>
+            </w:r>
+          </w:p>
+        </w:tc>
+      </w:tr>
+      <w:tr>
+        <w:tc>
+          <w:tcPr>
+            <w:tcW w:type="dxa" w:w="2880"/>
+          </w:tcPr>
+          <w:p>
+            <w:r>
+              <w:rPr>
+                <w:sz w:val="20"/>
+              </w:rPr>
+            </w:r>
+            <w:r>
+              <w:rPr>
+                <w:b/>
+                <w:sz w:val="20"/>
+              </w:rPr>
+              <w:t>Mid-Atlantic</w:t>
+            </w:r>
+          </w:p>
+        </w:tc>
+        <w:tc>
+          <w:tcPr>
+            <w:tcW w:type="dxa" w:w="2880"/>
+          </w:tcPr>
+          <w:p>
+            <w:r>
+              <w:rPr>
+                <w:sz w:val="20"/>
+              </w:rPr>
+            </w:r>
+            <w:r>
+              <w:rPr>
+                <w:sz w:val="20"/>
+              </w:rPr>
+              <w:t>Richmond, Virginia Beach, Frederick MD, Lancaster PA, Harrisburg, Annapolis, Roanoke, Charlottesville, Wilmington DE, Allentown</w:t>
+            </w:r>
+          </w:p>
+        </w:tc>
+        <w:tc>
+          <w:tcPr>
+            <w:tcW w:type="dxa" w:w="2880"/>
+          </w:tcPr>
+          <w:p>
+            <w:r>
+              <w:rPr>
+                <w:sz w:val="20"/>
+              </w:rPr>
+            </w:r>
+            <w:r>
+              <w:rPr>
+                <w:sz w:val="20"/>
+              </w:rPr>
+              <w:t>Yr 5–7</w:t>
+            </w:r>
+          </w:p>
+        </w:tc>
+      </w:tr>
+      <w:tr>
+        <w:tc>
+          <w:tcPr>
+            <w:tcW w:type="dxa" w:w="2880"/>
+          </w:tcPr>
+          <w:p>
+            <w:r>
+              <w:rPr>
+                <w:sz w:val="20"/>
+              </w:rPr>
+            </w:r>
+            <w:r>
+              <w:rPr>
+                <w:b/>
+                <w:sz w:val="20"/>
+              </w:rPr>
+              <w:t>Upper Midwest</w:t>
+            </w:r>
+          </w:p>
+        </w:tc>
+        <w:tc>
+          <w:tcPr>
+            <w:tcW w:type="dxa" w:w="2880"/>
+          </w:tcPr>
+          <w:p>
+            <w:r>
+              <w:rPr>
+                <w:sz w:val="20"/>
+              </w:rPr>
+            </w:r>
+            <w:r>
+              <w:rPr>
+                <w:sz w:val="20"/>
+              </w:rPr>
+              <w:t>Madison, Green Bay, Duluth, Fargo, Sioux Falls, Rochester MN, Appleton, Grand Rapids, Ann Arbor, Eau Claire</w:t>
+            </w:r>
+          </w:p>
+        </w:tc>
+        <w:tc>
+          <w:tcPr>
+            <w:tcW w:type="dxa" w:w="2880"/>
+          </w:tcPr>
+          <w:p>
+            <w:r>
+              <w:rPr>
+                <w:sz w:val="20"/>
+              </w:rPr>
+            </w:r>
+            <w:r>
+              <w:rPr>
+                <w:sz w:val="20"/>
+              </w:rPr>
+              <w:t>Yr 6–8</w:t>
+            </w:r>
+          </w:p>
+        </w:tc>
+      </w:tr>
+      <w:tr>
+        <w:tc>
+          <w:tcPr>
+            <w:tcW w:type="dxa" w:w="2880"/>
+          </w:tcPr>
+          <w:p>
+            <w:r>
+              <w:rPr>
+                <w:sz w:val="20"/>
+              </w:rPr>
+            </w:r>
+            <w:r>
+              <w:rPr>
+                <w:b/>
+                <w:sz w:val="20"/>
+              </w:rPr>
+              <w:t>Northeast</w:t>
+            </w:r>
+          </w:p>
+        </w:tc>
+        <w:tc>
+          <w:tcPr>
+            <w:tcW w:type="dxa" w:w="2880"/>
+          </w:tcPr>
+          <w:p>
+            <w:r>
+              <w:rPr>
+                <w:sz w:val="20"/>
+              </w:rPr>
+            </w:r>
+            <w:r>
+              <w:rPr>
+                <w:sz w:val="20"/>
+              </w:rPr>
+              <w:t>Portland ME, Manchester NH, Burlington VT, Providence, Worcester, Albany, Hartford, Stamford/Fairfield, Syracuse, Portsmouth</w:t>
+            </w:r>
+          </w:p>
+        </w:tc>
+        <w:tc>
+          <w:tcPr>
+            <w:tcW w:type="dxa" w:w="2880"/>
+          </w:tcPr>
+          <w:p>
+            <w:r>
+              <w:rPr>
+                <w:sz w:val="20"/>
+              </w:rPr>
+            </w:r>
+            <w:r>
+              <w:rPr>
+                <w:sz w:val="20"/>
+              </w:rPr>
+              <w:t>Yr 6–8</w:t>
+            </w:r>
+          </w:p>
+        </w:tc>
+      </w:tr>
+      <w:tr>
+        <w:tc>
+          <w:tcPr>
+            <w:tcW w:type="dxa" w:w="2880"/>
+          </w:tcPr>
+          <w:p>
+            <w:r>
+              <w:rPr>
+                <w:sz w:val="20"/>
+              </w:rPr>
+            </w:r>
+            <w:r>
+              <w:rPr>
+                <w:b/>
+                <w:sz w:val="20"/>
+              </w:rPr>
+              <w:t>California</w:t>
+            </w:r>
+          </w:p>
+        </w:tc>
+        <w:tc>
+          <w:tcPr>
+            <w:tcW w:type="dxa" w:w="2880"/>
+          </w:tcPr>
+          <w:p>
+            <w:r>
+              <w:rPr>
+                <w:sz w:val="20"/>
+              </w:rPr>
+            </w:r>
+            <w:r>
+              <w:rPr>
+                <w:sz w:val="20"/>
+              </w:rPr>
+              <w:t>Sacramento, Fresno, Santa Barbara, San Luis Obispo, Santa Rosa, Temecula, Palm Springs, Ventura/Oxnard, Modesto, Bakersfield</w:t>
+            </w:r>
+          </w:p>
+        </w:tc>
+        <w:tc>
+          <w:tcPr>
+            <w:tcW w:type="dxa" w:w="2880"/>
+          </w:tcPr>
+          <w:p>
+            <w:r>
+              <w:rPr>
+                <w:sz w:val="20"/>
+              </w:rPr>
+            </w:r>
+            <w:r>
+              <w:rPr>
+                <w:sz w:val="20"/>
+              </w:rPr>
+              <w:t>Yr 7–9</w:t>
+            </w:r>
+          </w:p>
+        </w:tc>
+      </w:tr>
+    </w:tbl>
+    <w:p>
+      <w:r>
+        <w:t xml:space="preserve">*Markets are illustrative candidates. </w:t>
+      </w:r>
+      <w:r>
+        <w:rPr>
+          <w:b/>
+        </w:rPr>
+        <w:t>Mega-metros (LA/SF/NYC/Chicago/Houston) are deliberately excluded as local editions</w:t>
+      </w:r>
+      <w:r>
+        <w:t xml:space="preserve"> per the right-size principle — used instead as regional advertiser hubs. Each region targets ~10 right-size markets and ~200K subscribers at maturity.*</w:t>
+      </w:r>
+    </w:p>
+    <w:p>
+      <w:r>
+        <w:rPr>
+          <w:b/>
+        </w:rPr>
+        <w:t>Sequencing logic.</w:t>
+      </w:r>
+      <w:r>
+        <w:t xml:space="preserve"> Prove the </w:t>
+      </w:r>
+      <w:r>
+        <w:rPr>
+          <w:b/>
+        </w:rPr>
+        <w:t>Southeast</w:t>
+      </w:r>
+      <w:r>
+        <w:t xml:space="preserve"> first (test → ~10 markets), then activate the already-seeded </w:t>
+      </w:r>
+      <w:r>
+        <w:rPr>
+          <w:b/>
+        </w:rPr>
+        <w:t>Midwest</w:t>
+      </w:r>
+      <w:r>
+        <w:t xml:space="preserve"> and </w:t>
+      </w:r>
+      <w:r>
+        <w:rPr>
+          <w:b/>
+        </w:rPr>
+        <w:t>Texas</w:t>
+      </w:r>
+      <w:r>
+        <w:t xml:space="preserve"> regions, then radiate outward ~</w:t>
+      </w:r>
+      <w:r>
+        <w:rPr>
+          <w:b/>
+        </w:rPr>
+        <w:t>2 regions per year</w:t>
+      </w:r>
+      <w:r>
+        <w:t xml:space="preserve"> after Year 4. Full national maturity (100 markets, 2M subs) is an </w:t>
+      </w:r>
+      <w:r>
+        <w:rPr>
+          <w:b/>
+        </w:rPr>
+        <w:t>~8–10-year horizon</w:t>
+      </w:r>
+      <w:r>
+        <w:t>; the 5-year North-Star (50 markets) is the midpoint waypoint en route.</w:t>
+      </w:r>
+    </w:p>
+    <w:p>
       <w:r>
         <w:br/>
       </w:r>
@@ -13243,6 +13995,766 @@
       </w:r>
       <w:r>
         <w:t xml:space="preserve"> growth capital and peak cumulative burn through Years 3–4.</w:t>
+      </w:r>
+    </w:p>
+    <w:p>
+      <w:pPr>
+        <w:pStyle w:val="Heading3"/>
+      </w:pPr>
+      <w:r>
+        <w:rPr>
+          <w:color w:val="2E5496"/>
+        </w:rPr>
+        <w:t>9.8 Terminal-state economics — full national scale (10 regions / 100 markets / 2M subscribers)</w:t>
+      </w:r>
+    </w:p>
+    <w:p>
+      <w:r>
+        <w:t xml:space="preserve">Long-range and illustrative. The </w:t>
+      </w:r>
+      <w:r>
+        <w:rPr>
+          <w:b/>
+        </w:rPr>
+        <w:t>3-year base case</w:t>
+      </w:r>
+      <w:r>
+        <w:t xml:space="preserve"> (§9.2) is the near-term plan; the </w:t>
+      </w:r>
+      <w:r>
+        <w:rPr>
+          <w:b/>
+        </w:rPr>
+        <w:t>5-year North-Star</w:t>
+      </w:r>
+      <w:r>
+        <w:t xml:space="preserve"> (§9.4, 50 markets) is the midpoint waypoint; the table below is the </w:t>
+      </w:r>
+      <w:r>
+        <w:rPr>
+          <w:b/>
+        </w:rPr>
+        <w:t>fully executed national footprint</w:t>
+      </w:r>
+      <w:r>
+        <w:t xml:space="preserve"> (§8.4).</w:t>
+      </w:r>
+    </w:p>
+    <w:tbl>
+      <w:tblPr>
+        <w:tblStyle w:val="TableGrid"/>
+        <w:tblW w:type="auto" w:w="0"/>
+        <w:tblLayout w:type="autofit"/>
+        <w:tblLook w:firstColumn="1" w:firstRow="1" w:lastColumn="0" w:lastRow="0" w:noHBand="0" w:noVBand="1" w:val="04A0"/>
+      </w:tblPr>
+      <w:tblGrid>
+        <w:gridCol w:w="1440"/>
+        <w:gridCol w:w="1440"/>
+        <w:gridCol w:w="1440"/>
+        <w:gridCol w:w="1440"/>
+        <w:gridCol w:w="1440"/>
+        <w:gridCol w:w="1440"/>
+      </w:tblGrid>
+      <w:tr>
+        <w:tc>
+          <w:tcPr>
+            <w:tcW w:type="dxa" w:w="1440"/>
+            <w:shd w:val="clear" w:fill="DBE5F1"/>
+          </w:tcPr>
+          <w:p>
+            <w:r>
+              <w:rPr>
+                <w:b/>
+                <w:sz w:val="20"/>
+              </w:rPr>
+            </w:r>
+            <w:r>
+              <w:rPr>
+                <w:b/>
+                <w:sz w:val="20"/>
+              </w:rPr>
+              <w:t>Horizon</w:t>
+            </w:r>
+          </w:p>
+        </w:tc>
+        <w:tc>
+          <w:tcPr>
+            <w:tcW w:type="dxa" w:w="1440"/>
+            <w:shd w:val="clear" w:fill="DBE5F1"/>
+          </w:tcPr>
+          <w:p>
+            <w:r>
+              <w:rPr>
+                <w:b/>
+                <w:sz w:val="20"/>
+              </w:rPr>
+            </w:r>
+            <w:r>
+              <w:rPr>
+                <w:b/>
+                <w:sz w:val="20"/>
+              </w:rPr>
+              <w:t>Regions live</w:t>
+            </w:r>
+          </w:p>
+        </w:tc>
+        <w:tc>
+          <w:tcPr>
+            <w:tcW w:type="dxa" w:w="1440"/>
+            <w:shd w:val="clear" w:fill="DBE5F1"/>
+          </w:tcPr>
+          <w:p>
+            <w:r>
+              <w:rPr>
+                <w:b/>
+                <w:sz w:val="20"/>
+              </w:rPr>
+            </w:r>
+            <w:r>
+              <w:rPr>
+                <w:b/>
+                <w:sz w:val="20"/>
+              </w:rPr>
+              <w:t>Markets (cum)</w:t>
+            </w:r>
+          </w:p>
+        </w:tc>
+        <w:tc>
+          <w:tcPr>
+            <w:tcW w:type="dxa" w:w="1440"/>
+            <w:shd w:val="clear" w:fill="DBE5F1"/>
+          </w:tcPr>
+          <w:p>
+            <w:r>
+              <w:rPr>
+                <w:b/>
+                <w:sz w:val="20"/>
+              </w:rPr>
+            </w:r>
+            <w:r>
+              <w:rPr>
+                <w:b/>
+                <w:sz w:val="20"/>
+              </w:rPr>
+              <w:t>Subscribers (cum)</w:t>
+            </w:r>
+          </w:p>
+        </w:tc>
+        <w:tc>
+          <w:tcPr>
+            <w:tcW w:type="dxa" w:w="1440"/>
+            <w:shd w:val="clear" w:fill="DBE5F1"/>
+          </w:tcPr>
+          <w:p>
+            <w:r>
+              <w:rPr>
+                <w:b/>
+                <w:sz w:val="20"/>
+              </w:rPr>
+            </w:r>
+            <w:r>
+              <w:rPr>
+                <w:b/>
+                <w:sz w:val="20"/>
+              </w:rPr>
+              <w:t>Blended ARPU</w:t>
+            </w:r>
+          </w:p>
+        </w:tc>
+        <w:tc>
+          <w:tcPr>
+            <w:tcW w:type="dxa" w:w="1440"/>
+            <w:shd w:val="clear" w:fill="DBE5F1"/>
+          </w:tcPr>
+          <w:p>
+            <w:r>
+              <w:rPr>
+                <w:b/>
+                <w:sz w:val="20"/>
+              </w:rPr>
+            </w:r>
+            <w:r>
+              <w:rPr>
+                <w:b/>
+                <w:sz w:val="20"/>
+              </w:rPr>
+              <w:t>Revenue</w:t>
+            </w:r>
+          </w:p>
+        </w:tc>
+      </w:tr>
+      <w:tr>
+        <w:tc>
+          <w:tcPr>
+            <w:tcW w:type="dxa" w:w="1440"/>
+          </w:tcPr>
+          <w:p>
+            <w:r>
+              <w:rPr>
+                <w:sz w:val="20"/>
+              </w:rPr>
+            </w:r>
+            <w:r>
+              <w:rPr>
+                <w:sz w:val="20"/>
+              </w:rPr>
+              <w:t>Year 3 (base case)</w:t>
+            </w:r>
+          </w:p>
+        </w:tc>
+        <w:tc>
+          <w:tcPr>
+            <w:tcW w:type="dxa" w:w="1440"/>
+          </w:tcPr>
+          <w:p>
+            <w:r>
+              <w:rPr>
+                <w:sz w:val="20"/>
+              </w:rPr>
+            </w:r>
+            <w:r>
+              <w:rPr>
+                <w:sz w:val="20"/>
+              </w:rPr>
+              <w:t>SE + MW/TX starting</w:t>
+            </w:r>
+          </w:p>
+        </w:tc>
+        <w:tc>
+          <w:tcPr>
+            <w:tcW w:type="dxa" w:w="1440"/>
+          </w:tcPr>
+          <w:p>
+            <w:r>
+              <w:rPr>
+                <w:sz w:val="20"/>
+              </w:rPr>
+            </w:r>
+            <w:r>
+              <w:rPr>
+                <w:sz w:val="20"/>
+              </w:rPr>
+              <w:t>~30</w:t>
+            </w:r>
+          </w:p>
+        </w:tc>
+        <w:tc>
+          <w:tcPr>
+            <w:tcW w:type="dxa" w:w="1440"/>
+          </w:tcPr>
+          <w:p>
+            <w:r>
+              <w:rPr>
+                <w:sz w:val="20"/>
+              </w:rPr>
+            </w:r>
+            <w:r>
+              <w:rPr>
+                <w:sz w:val="20"/>
+              </w:rPr>
+              <w:t>~0.35M</w:t>
+            </w:r>
+          </w:p>
+        </w:tc>
+        <w:tc>
+          <w:tcPr>
+            <w:tcW w:type="dxa" w:w="1440"/>
+          </w:tcPr>
+          <w:p>
+            <w:r>
+              <w:rPr>
+                <w:sz w:val="20"/>
+              </w:rPr>
+            </w:r>
+            <w:r>
+              <w:rPr>
+                <w:sz w:val="20"/>
+              </w:rPr>
+              <w:t>~$26</w:t>
+            </w:r>
+          </w:p>
+        </w:tc>
+        <w:tc>
+          <w:tcPr>
+            <w:tcW w:type="dxa" w:w="1440"/>
+          </w:tcPr>
+          <w:p>
+            <w:r>
+              <w:rPr>
+                <w:sz w:val="20"/>
+              </w:rPr>
+            </w:r>
+            <w:r>
+              <w:rPr>
+                <w:sz w:val="20"/>
+              </w:rPr>
+              <w:t>~$9M</w:t>
+            </w:r>
+          </w:p>
+        </w:tc>
+      </w:tr>
+      <w:tr>
+        <w:tc>
+          <w:tcPr>
+            <w:tcW w:type="dxa" w:w="1440"/>
+          </w:tcPr>
+          <w:p>
+            <w:r>
+              <w:rPr>
+                <w:sz w:val="20"/>
+              </w:rPr>
+            </w:r>
+            <w:r>
+              <w:rPr>
+                <w:sz w:val="20"/>
+              </w:rPr>
+              <w:t>Year 5 (North-Star waypoint)</w:t>
+            </w:r>
+          </w:p>
+        </w:tc>
+        <w:tc>
+          <w:tcPr>
+            <w:tcW w:type="dxa" w:w="1440"/>
+          </w:tcPr>
+          <w:p>
+            <w:r>
+              <w:rPr>
+                <w:sz w:val="20"/>
+              </w:rPr>
+            </w:r>
+            <w:r>
+              <w:rPr>
+                <w:sz w:val="20"/>
+              </w:rPr>
+              <w:t>~4</w:t>
+            </w:r>
+          </w:p>
+        </w:tc>
+        <w:tc>
+          <w:tcPr>
+            <w:tcW w:type="dxa" w:w="1440"/>
+          </w:tcPr>
+          <w:p>
+            <w:r>
+              <w:rPr>
+                <w:sz w:val="20"/>
+              </w:rPr>
+            </w:r>
+            <w:r>
+              <w:rPr>
+                <w:sz w:val="20"/>
+              </w:rPr>
+              <w:t>~50</w:t>
+            </w:r>
+          </w:p>
+        </w:tc>
+        <w:tc>
+          <w:tcPr>
+            <w:tcW w:type="dxa" w:w="1440"/>
+          </w:tcPr>
+          <w:p>
+            <w:r>
+              <w:rPr>
+                <w:sz w:val="20"/>
+              </w:rPr>
+            </w:r>
+            <w:r>
+              <w:rPr>
+                <w:sz w:val="20"/>
+              </w:rPr>
+              <w:t>~1.14M</w:t>
+            </w:r>
+          </w:p>
+        </w:tc>
+        <w:tc>
+          <w:tcPr>
+            <w:tcW w:type="dxa" w:w="1440"/>
+          </w:tcPr>
+          <w:p>
+            <w:r>
+              <w:rPr>
+                <w:sz w:val="20"/>
+              </w:rPr>
+            </w:r>
+            <w:r>
+              <w:rPr>
+                <w:sz w:val="20"/>
+              </w:rPr>
+              <w:t>~$45</w:t>
+            </w:r>
+          </w:p>
+        </w:tc>
+        <w:tc>
+          <w:tcPr>
+            <w:tcW w:type="dxa" w:w="1440"/>
+          </w:tcPr>
+          <w:p>
+            <w:r>
+              <w:rPr>
+                <w:sz w:val="20"/>
+              </w:rPr>
+            </w:r>
+            <w:r>
+              <w:rPr>
+                <w:sz w:val="20"/>
+              </w:rPr>
+              <w:t>~$51M</w:t>
+            </w:r>
+          </w:p>
+        </w:tc>
+      </w:tr>
+      <w:tr>
+        <w:tc>
+          <w:tcPr>
+            <w:tcW w:type="dxa" w:w="1440"/>
+          </w:tcPr>
+          <w:p>
+            <w:r>
+              <w:rPr>
+                <w:sz w:val="20"/>
+              </w:rPr>
+            </w:r>
+            <w:r>
+              <w:rPr>
+                <w:sz w:val="20"/>
+              </w:rPr>
+              <w:t>Year 7</w:t>
+            </w:r>
+          </w:p>
+        </w:tc>
+        <w:tc>
+          <w:tcPr>
+            <w:tcW w:type="dxa" w:w="1440"/>
+          </w:tcPr>
+          <w:p>
+            <w:r>
+              <w:rPr>
+                <w:sz w:val="20"/>
+              </w:rPr>
+            </w:r>
+            <w:r>
+              <w:rPr>
+                <w:sz w:val="20"/>
+              </w:rPr>
+              <w:t>~7</w:t>
+            </w:r>
+          </w:p>
+        </w:tc>
+        <w:tc>
+          <w:tcPr>
+            <w:tcW w:type="dxa" w:w="1440"/>
+          </w:tcPr>
+          <w:p>
+            <w:r>
+              <w:rPr>
+                <w:sz w:val="20"/>
+              </w:rPr>
+            </w:r>
+            <w:r>
+              <w:rPr>
+                <w:sz w:val="20"/>
+              </w:rPr>
+              <w:t>~75</w:t>
+            </w:r>
+          </w:p>
+        </w:tc>
+        <w:tc>
+          <w:tcPr>
+            <w:tcW w:type="dxa" w:w="1440"/>
+          </w:tcPr>
+          <w:p>
+            <w:r>
+              <w:rPr>
+                <w:sz w:val="20"/>
+              </w:rPr>
+            </w:r>
+            <w:r>
+              <w:rPr>
+                <w:sz w:val="20"/>
+              </w:rPr>
+              <w:t>~1.55M</w:t>
+            </w:r>
+          </w:p>
+        </w:tc>
+        <w:tc>
+          <w:tcPr>
+            <w:tcW w:type="dxa" w:w="1440"/>
+          </w:tcPr>
+          <w:p>
+            <w:r>
+              <w:rPr>
+                <w:sz w:val="20"/>
+              </w:rPr>
+            </w:r>
+            <w:r>
+              <w:rPr>
+                <w:sz w:val="20"/>
+              </w:rPr>
+              <w:t>~$45</w:t>
+            </w:r>
+          </w:p>
+        </w:tc>
+        <w:tc>
+          <w:tcPr>
+            <w:tcW w:type="dxa" w:w="1440"/>
+          </w:tcPr>
+          <w:p>
+            <w:r>
+              <w:rPr>
+                <w:sz w:val="20"/>
+              </w:rPr>
+            </w:r>
+            <w:r>
+              <w:rPr>
+                <w:sz w:val="20"/>
+              </w:rPr>
+              <w:t>~$70M</w:t>
+            </w:r>
+          </w:p>
+        </w:tc>
+      </w:tr>
+      <w:tr>
+        <w:tc>
+          <w:tcPr>
+            <w:tcW w:type="dxa" w:w="1440"/>
+          </w:tcPr>
+          <w:p>
+            <w:r>
+              <w:rPr>
+                <w:sz w:val="20"/>
+              </w:rPr>
+            </w:r>
+            <w:r>
+              <w:rPr>
+                <w:b/>
+                <w:sz w:val="20"/>
+              </w:rPr>
+              <w:t>Year 9–10 (terminal)</w:t>
+            </w:r>
+          </w:p>
+        </w:tc>
+        <w:tc>
+          <w:tcPr>
+            <w:tcW w:type="dxa" w:w="1440"/>
+          </w:tcPr>
+          <w:p>
+            <w:r>
+              <w:rPr>
+                <w:sz w:val="20"/>
+              </w:rPr>
+            </w:r>
+            <w:r>
+              <w:rPr>
+                <w:b/>
+                <w:sz w:val="20"/>
+              </w:rPr>
+              <w:t>10</w:t>
+            </w:r>
+          </w:p>
+        </w:tc>
+        <w:tc>
+          <w:tcPr>
+            <w:tcW w:type="dxa" w:w="1440"/>
+          </w:tcPr>
+          <w:p>
+            <w:r>
+              <w:rPr>
+                <w:sz w:val="20"/>
+              </w:rPr>
+            </w:r>
+            <w:r>
+              <w:rPr>
+                <w:b/>
+                <w:sz w:val="20"/>
+              </w:rPr>
+              <w:t>100</w:t>
+            </w:r>
+          </w:p>
+        </w:tc>
+        <w:tc>
+          <w:tcPr>
+            <w:tcW w:type="dxa" w:w="1440"/>
+          </w:tcPr>
+          <w:p>
+            <w:r>
+              <w:rPr>
+                <w:sz w:val="20"/>
+              </w:rPr>
+            </w:r>
+            <w:r>
+              <w:rPr>
+                <w:b/>
+                <w:sz w:val="20"/>
+              </w:rPr>
+              <w:t>~2.0M</w:t>
+            </w:r>
+          </w:p>
+        </w:tc>
+        <w:tc>
+          <w:tcPr>
+            <w:tcW w:type="dxa" w:w="1440"/>
+          </w:tcPr>
+          <w:p>
+            <w:r>
+              <w:rPr>
+                <w:sz w:val="20"/>
+              </w:rPr>
+            </w:r>
+            <w:r>
+              <w:rPr>
+                <w:b/>
+                <w:sz w:val="20"/>
+              </w:rPr>
+              <w:t>~$45</w:t>
+            </w:r>
+          </w:p>
+        </w:tc>
+        <w:tc>
+          <w:tcPr>
+            <w:tcW w:type="dxa" w:w="1440"/>
+          </w:tcPr>
+          <w:p>
+            <w:r>
+              <w:rPr>
+                <w:sz w:val="20"/>
+              </w:rPr>
+            </w:r>
+            <w:r>
+              <w:rPr>
+                <w:b/>
+                <w:sz w:val="20"/>
+              </w:rPr>
+              <w:t>~$90M</w:t>
+            </w:r>
+          </w:p>
+        </w:tc>
+      </w:tr>
+    </w:tbl>
+    <w:p>
+      <w:r>
+        <w:t xml:space="preserve">At terminal scale — </w:t>
+      </w:r>
+      <w:r>
+        <w:rPr>
+          <w:b/>
+        </w:rPr>
+        <w:t>2.0M subs × ~$45 blended ARPU</w:t>
+      </w:r>
+      <w:r>
+        <w:t xml:space="preserve"> (range $35–55 → </w:t>
+      </w:r>
+      <w:r>
+        <w:rPr>
+          <w:b/>
+        </w:rPr>
+        <w:t>~$70–110M revenue</w:t>
+      </w:r>
+      <w:r>
+        <w:t>):</w:t>
+      </w:r>
+    </w:p>
+    <w:p>
+      <w:pPr>
+        <w:pStyle w:val="ListBullet"/>
+      </w:pPr>
+      <w:r>
+        <w:t xml:space="preserve">EBITDA at a mature </w:t>
+      </w:r>
+      <w:r>
+        <w:rPr>
+          <w:b/>
+        </w:rPr>
+        <w:t>~28–30%</w:t>
+      </w:r>
+      <w:r>
+        <w:t xml:space="preserve"> margin ≈ </w:t>
+      </w:r>
+      <w:r>
+        <w:rPr>
+          <w:b/>
+        </w:rPr>
+        <w:t>~$25–33M/yr</w:t>
+      </w:r>
+      <w:r>
+        <w:t>.</w:t>
+      </w:r>
+    </w:p>
+    <w:p>
+      <w:pPr>
+        <w:pStyle w:val="ListBullet"/>
+      </w:pPr>
+      <w:r>
+        <w:t xml:space="preserve">Indicative enterprise value: revenue </w:t>
+      </w:r>
+      <w:r>
+        <w:rPr>
+          <w:b/>
+        </w:rPr>
+        <w:t>3–5×</w:t>
+      </w:r>
+      <w:r>
+        <w:t xml:space="preserve"> → ~$270–450M; EBITDA </w:t>
+      </w:r>
+      <w:r>
+        <w:rPr>
+          <w:b/>
+        </w:rPr>
+        <w:t>12–18×</w:t>
+      </w:r>
+      <w:r>
+        <w:t xml:space="preserve"> (on ~$27M) → ~$300–490M → </w:t>
+      </w:r>
+      <w:r>
+        <w:rPr>
+          <w:b/>
+        </w:rPr>
+        <w:t>blended ~$300–450M for PoC alone</w:t>
+      </w:r>
+      <w:r>
+        <w:t xml:space="preserve"> (before Pet Intelligence; combined Ventures higher).</w:t>
+      </w:r>
+    </w:p>
+    <w:p>
+      <w:pPr>
+        <w:pStyle w:val="ListBullet"/>
+      </w:pPr>
+      <w:r>
+        <w:rPr>
+          <w:b/>
+        </w:rPr>
+        <w:t>Capital:</w:t>
+      </w:r>
+      <w:r>
+        <w:t xml:space="preserve"> the build is self-funding region-by-region once early regions mature; the gating constraint is </w:t>
+      </w:r>
+      <w:r>
+        <w:rPr>
+          <w:b/>
+        </w:rPr>
+        <w:t>growth capital to launch regions ahead of maturity (~$8–12M+ cumulative through the high-growth years)</w:t>
+      </w:r>
+      <w:r>
+        <w:t>, not terminal economics.</w:t>
+      </w:r>
+    </w:p>
+    <w:p>
+      <w:pPr>
+        <w:pStyle w:val="ListBullet"/>
+      </w:pPr>
+      <w:r>
+        <w:rPr>
+          <w:b/>
+        </w:rPr>
+        <w:t>Assumes</w:t>
+      </w:r>
+      <w:r>
+        <w:t xml:space="preserve"> ~63% market-graduation survivorship (attempt more than 100 to land 100 viable) and ARPU maturation via the full 8-line stack — </w:t>
+      </w:r>
+      <w:r>
+        <w:rPr>
+          <w:b/>
+        </w:rPr>
+        <w:t>not ad revenue alone.</w:t>
       </w:r>
     </w:p>
     <w:p>

</xml_diff>

<commit_message>
Adopt reader-first principle: no programmatic/CPM ads in the newsletter
Bake the no-CPM stance into the business plan: add a reader-first principle in
S3.2 (no commodity/programmatic ads; protects trust, engagement, fatigue, and
the data asset), reframe monetization line 8 as 'curated sponsorship & member-
brand integration' (sold on value, not CPM), relabel the ARPU 'ad' stream as
intent-targeted sponsorship (still ~$45 blended, holds without programmatic),
and update the exec-summary stack description. Member-brand demand preserved as
sponsorship/integration, not banner inventory. Regenerated Word export.

Co-Authored-By: Claude Opus 4.8 (1M context) <noreply@anthropic.com>
Claude-Session: https://claude.ai/code/session_016gWMtWeutWcnpqhZxT7WHC
</commit_message>
<xml_diff>
--- a/PoC-Business-Plan.docx
+++ b/PoC-Business-Plan.docx
@@ -296,7 +296,16 @@
         <w:t>seven-line monetization stack</w:t>
       </w:r>
       <w:r>
-        <w:t xml:space="preserve"> (insurance lead-gen, housing, data, card, events, lead-gen, ads) removes single-line risk; and a </w:t>
+        <w:t xml:space="preserve"> (insurance lead-gen, housing, data, card, events, directory lead-gen, curated sponsorship — </w:t>
+      </w:r>
+      <w:r>
+        <w:rPr>
+          <w:b/>
+        </w:rPr>
+        <w:t>no programmatic/CPM ads</w:t>
+      </w:r>
+      <w:r>
+        <w:t xml:space="preserve">) removes single-line risk; and a </w:t>
       </w:r>
       <w:r>
         <w:rPr>
@@ -1165,6 +1174,35 @@
     </w:p>
     <w:p>
       <w:r>
+        <w:rPr>
+          <w:b/>
+        </w:rPr>
+        <w:t>Reader-first principle — no programmatic/CPM ads.</w:t>
+      </w:r>
+      <w:r>
+        <w:t xml:space="preserve"> The product carries </w:t>
+      </w:r>
+      <w:r>
+        <w:rPr>
+          <w:b/>
+        </w:rPr>
+        <w:t>no commodity or programmatic CPM advertising.</w:t>
+      </w:r>
+      <w:r>
+        <w:t xml:space="preserve"> A clean, trusted, high-signal edition protects engagement and slows content fatigue, which protects the first-party data asset (the crown jewel) — and trust is non-negotiable next to vet-wellness/health (YMYL) content. Member-brand demand — our single biggest structural advantage — is monetized as </w:t>
+      </w:r>
+      <w:r>
+        <w:rPr>
+          <w:b/>
+        </w:rPr>
+        <w:t>curated sponsorship and integration sold on value, not impressions</w:t>
+      </w:r>
+      <w:r>
+        <w:t xml:space="preserve"> (see §7), not as banner inventory.</w:t>
+      </w:r>
+    </w:p>
+    <w:p>
+      <w:r>
         <w:br/>
       </w:r>
     </w:p>
@@ -2865,7 +2903,16 @@
         <w:t>Sequence monetization by durability/margin, not by ease.</w:t>
       </w:r>
       <w:r>
-        <w:t xml:space="preserve"> Ads are a complement, never the core.</w:t>
+        <w:t xml:space="preserve"> Curated sponsorship is a complement, never the core — and </w:t>
+      </w:r>
+      <w:r>
+        <w:rPr>
+          <w:b/>
+        </w:rPr>
+        <w:t>the product carries no programmatic/CPM advertising</w:t>
+      </w:r>
+      <w:r>
+        <w:t xml:space="preserve"> (§3.2).</w:t>
       </w:r>
     </w:p>
     <w:tbl>
@@ -3695,7 +3742,7 @@
                 <w:b/>
                 <w:sz w:val="20"/>
               </w:rPr>
-              <w:t>Newsletter sponsorship / ads</w:t>
+              <w:t>Curated sponsorship &amp; member-brand integration</w:t>
             </w:r>
           </w:p>
         </w:tc>
@@ -3713,7 +3760,7 @@
               <w:rPr>
                 <w:sz w:val="20"/>
               </w:rPr>
-              <w:t>National member brands (sold centrally) + local SMBs</w:t>
+              <w:t>National member brands (sold centrally) + select local sponsors</w:t>
             </w:r>
           </w:p>
         </w:tc>
@@ -3731,7 +3778,14 @@
               <w:rPr>
                 <w:sz w:val="20"/>
               </w:rPr>
-              <w:t>Complement; CPMs ~$25–45</w:t>
+              <w:t xml:space="preserve">Sold on value/association (one "presented by" per edition; integrations, product-JV) — </w:t>
+            </w:r>
+            <w:r>
+              <w:rPr>
+                <w:b/>
+                <w:sz w:val="20"/>
+              </w:rPr>
+              <w:t>not CPM; no programmatic</w:t>
             </w:r>
           </w:p>
         </w:tc>
@@ -3847,7 +3901,7 @@
                 <w:b/>
                 <w:sz w:val="20"/>
               </w:rPr>
-              <w:t>Ad</w:t>
+              <w:t>Sponsorship</w:t>
             </w:r>
           </w:p>
         </w:tc>
@@ -4200,7 +4254,25 @@
     </w:tbl>
     <w:p>
       <w:r>
-        <w:t>This ARPU expansion — not subscriber count alone — is what makes the unit economics and the North-Star work.</w:t>
+        <w:t xml:space="preserve">The sponsorship line is </w:t>
+      </w:r>
+      <w:r>
+        <w:rPr>
+          <w:b/>
+        </w:rPr>
+        <w:t>intent-targeted, curated member-brand sponsorship — not commodity CPM</w:t>
+      </w:r>
+      <w:r>
+        <w:t xml:space="preserve"> (§3.2). This ARPU expansion — not subscriber count alone — is what makes the unit economics and the North-Star work, and it holds </w:t>
+      </w:r>
+      <w:r>
+        <w:rPr>
+          <w:b/>
+        </w:rPr>
+        <w:t>without</w:t>
+      </w:r>
+      <w:r>
+        <w:t xml:space="preserve"> programmatic advertising.</w:t>
       </w:r>
     </w:p>
     <w:p>

</xml_diff>

<commit_message>
Add social presence + social commerce (Instagram/TikTok; TikTok Shop live selling)
Recognize social as necessity and opportunity: add S7.2 covering Instagram/
TikTok as a low-cost acquisition funnel (convert to owned channels - the Dodo
lesson) and TikTok Shop live selling as a new commerce line, including a
turnkey live-selling channel for enterprise member-brand partners (commission
on GMV + service fees + event sponsorship; feeds product-JV, member-brand-
connection mission, and the data panel). Consistent with the no-CPM principle
(organic + commerce, not ad inventory). Add to product suite (S3.1) and exec
summary; add social-platform/TikTok-regulatory risk row (S11) with own-the-
relationship + multi-platform guardrails. Regenerated Word export.

Co-Authored-By: Claude Opus 4.8 (1M context) <noreply@anthropic.com>
Claude-Session: https://claude.ai/code/session_016gWMtWeutWcnpqhZxT7WHC
</commit_message>
<xml_diff>
--- a/PoC-Business-Plan.docx
+++ b/PoC-Business-Plan.docx
@@ -196,7 +196,7 @@
         <w:t>citywide pet discount card</w:t>
       </w:r>
       <w:r>
-        <w:t xml:space="preserve">, and a consent-based </w:t>
+        <w:t xml:space="preserve">, a consent-based </w:t>
       </w:r>
       <w:r>
         <w:rPr>
@@ -205,7 +205,25 @@
         <w:t>first-party data panel</w:t>
       </w:r>
       <w:r>
-        <w:t xml:space="preserve">. One property per metro, modeled on the validated 6AM City / Good Daily local-newsletter playbook but focused exclusively on the pet owner. </w:t>
+        <w:t xml:space="preserve">, and </w:t>
+      </w:r>
+      <w:r>
+        <w:rPr>
+          <w:b/>
+        </w:rPr>
+        <w:t>Instagram/TikTok</w:t>
+      </w:r>
+      <w:r>
+        <w:t xml:space="preserve"> social channels (including </w:t>
+      </w:r>
+      <w:r>
+        <w:rPr>
+          <w:b/>
+        </w:rPr>
+        <w:t>TikTok Shop live selling</w:t>
+      </w:r>
+      <w:r>
+        <w:t xml:space="preserve"> for member brands). One property per metro, modeled on the validated 6AM City / Good Daily local-newsletter playbook but focused exclusively on the pet owner. </w:t>
       </w:r>
       <w:r>
         <w:rPr>
@@ -1127,6 +1145,29 @@
       </w:r>
       <w:r>
         <w:t xml:space="preserve"> — the crown-jewel asset.</w:t>
+      </w:r>
+    </w:p>
+    <w:p>
+      <w:pPr>
+        <w:pStyle w:val="ListBullet"/>
+      </w:pPr>
+      <w:r>
+        <w:rPr>
+          <w:b/>
+        </w:rPr>
+        <w:t>Social channels (Instagram + TikTok)</w:t>
+      </w:r>
+      <w:r>
+        <w:t xml:space="preserve"> — local short-form content as a discovery/acquisition funnel into owned email/SMS, plus </w:t>
+      </w:r>
+      <w:r>
+        <w:rPr>
+          <w:b/>
+        </w:rPr>
+        <w:t>TikTok Shop live-selling</w:t>
+      </w:r>
+      <w:r>
+        <w:t xml:space="preserve"> of member-brand products (social commerce).</w:t>
       </w:r>
     </w:p>
     <w:p>
@@ -4276,6 +4317,277 @@
       </w:r>
     </w:p>
     <w:p>
+      <w:pPr>
+        <w:pStyle w:val="Heading3"/>
+      </w:pPr>
+      <w:r>
+        <w:rPr>
+          <w:color w:val="2E5496"/>
+        </w:rPr>
+        <w:t>7.2 Social presence &amp; social commerce (Instagram, TikTok, TikTok Shop)</w:t>
+      </w:r>
+    </w:p>
+    <w:p>
+      <w:r>
+        <w:rPr>
+          <w:b/>
+        </w:rPr>
+        <w:t>Why it's necessary.</w:t>
+      </w:r>
+      <w:r>
+        <w:t xml:space="preserve"> Pet discovery, community, and increasingly *purchase* now happen on </w:t>
+      </w:r>
+      <w:r>
+        <w:rPr>
+          <w:b/>
+        </w:rPr>
+        <w:t>Instagram (Reels) and TikTok</w:t>
+      </w:r>
+      <w:r>
+        <w:t xml:space="preserve">; a local pet brand without a social presence is invisible to the next generation of owners — and social is the </w:t>
+      </w:r>
+      <w:r>
+        <w:rPr>
+          <w:b/>
+        </w:rPr>
+        <w:t>lowest-cost top-of-funnel</w:t>
+      </w:r>
+      <w:r>
+        <w:t xml:space="preserve"> for subscriber acquisition.</w:t>
+      </w:r>
+    </w:p>
+    <w:p>
+      <w:r>
+        <w:rPr>
+          <w:b/>
+        </w:rPr>
+        <w:t>Two roles:</w:t>
+      </w:r>
+    </w:p>
+    <w:p>
+      <w:pPr>
+        <w:pStyle w:val="ListNumber"/>
+      </w:pPr>
+      <w:r>
+        <w:rPr>
+          <w:b/>
+        </w:rPr>
+        <w:t>Acquisition + community (top of funnel).</w:t>
+      </w:r>
+      <w:r>
+        <w:t xml:space="preserve"> Local short-form content (adoptable pets, local spots, events, vet-wellness tips) drives discovery → convert followers into </w:t>
+      </w:r>
+      <w:r>
+        <w:rPr>
+          <w:b/>
+        </w:rPr>
+        <w:t>owned email/SMS subscribers and panel opt-ins.</w:t>
+      </w:r>
+      <w:r>
+        <w:t xml:space="preserve"> *Discipline (the Dodo lesson): social is rented reach — use it to acquire, but own the relationship.* Run </w:t>
+      </w:r>
+      <w:r>
+        <w:rPr>
+          <w:b/>
+        </w:rPr>
+        <w:t>multi-platform</w:t>
+      </w:r>
+      <w:r>
+        <w:t xml:space="preserve"> (IG + TikTok + YouTube Shorts) to avoid single-platform dependency.</w:t>
+      </w:r>
+    </w:p>
+    <w:p>
+      <w:pPr>
+        <w:pStyle w:val="ListNumber"/>
+      </w:pPr>
+      <w:r>
+        <w:rPr>
+          <w:b/>
+        </w:rPr>
+        <w:t>Social commerce — TikTok Shop live selling.</w:t>
+      </w:r>
+      <w:r>
+        <w:t xml:space="preserve"> Our trusted local audience + events muscle + community is an ideal engine for </w:t>
+      </w:r>
+      <w:r>
+        <w:rPr>
+          <w:b/>
+        </w:rPr>
+        <w:t>live shopping</w:t>
+      </w:r>
+      <w:r>
+        <w:t xml:space="preserve">: produce </w:t>
+      </w:r>
+      <w:r>
+        <w:rPr>
+          <w:b/>
+        </w:rPr>
+        <w:t>TikTok Shop live-selling events</w:t>
+      </w:r>
+      <w:r>
+        <w:t xml:space="preserve"> for member-brand pet products to an engaged, local, high-intent audience — online and tied to IRL events (adoption days, expos).</w:t>
+      </w:r>
+    </w:p>
+    <w:p>
+      <w:r>
+        <w:rPr>
+          <w:b/>
+        </w:rPr>
+        <w:t>The enterprise opportunity (member-brand partners).</w:t>
+      </w:r>
+      <w:r>
+        <w:t xml:space="preserve"> Offer </w:t>
+      </w:r>
+      <w:r>
+        <w:rPr>
+          <w:b/>
+        </w:rPr>
+        <w:t>enterprise member-brand partners</w:t>
+      </w:r>
+      <w:r>
+        <w:t xml:space="preserve"> a turnkey </w:t>
+      </w:r>
+      <w:r>
+        <w:rPr>
+          <w:b/>
+        </w:rPr>
+        <w:t>live-selling channel</w:t>
+      </w:r>
+      <w:r>
+        <w:t xml:space="preserve">: PoC supplies the audience, hosts/creators, local activation, and production; the brand supplies product. Revenue via </w:t>
+      </w:r>
+      <w:r>
+        <w:rPr>
+          <w:b/>
+        </w:rPr>
+        <w:t>commission/affiliate take on GMV + a production/service fee + live-event sponsorship.</w:t>
+      </w:r>
+      <w:r>
+        <w:t xml:space="preserve"> It directly advances the </w:t>
+      </w:r>
+      <w:r>
+        <w:rPr>
+          <w:b/>
+        </w:rPr>
+        <w:t>member-brand-local-connection</w:t>
+      </w:r>
+      <w:r>
+        <w:t xml:space="preserve"> mission, feeds the </w:t>
+      </w:r>
+      <w:r>
+        <w:rPr>
+          <w:b/>
+        </w:rPr>
+        <w:t>product-JV</w:t>
+      </w:r>
+      <w:r>
+        <w:t xml:space="preserve"> line, and generates </w:t>
+      </w:r>
+      <w:r>
+        <w:rPr>
+          <w:b/>
+        </w:rPr>
+        <w:t>first-party purchase-intent data</w:t>
+      </w:r>
+      <w:r>
+        <w:t xml:space="preserve"> for the panel / Pet Intelligence.</w:t>
+      </w:r>
+    </w:p>
+    <w:p>
+      <w:r>
+        <w:rPr>
+          <w:b/>
+        </w:rPr>
+        <w:t>Revenue model &amp; fit.</w:t>
+      </w:r>
+      <w:r>
+        <w:t xml:space="preserve"> Primarily </w:t>
+      </w:r>
+      <w:r>
+        <w:rPr>
+          <w:b/>
+        </w:rPr>
+        <w:t>commerce/affiliate take on GMV</w:t>
+      </w:r>
+      <w:r>
+        <w:t xml:space="preserve"> (expands the §7.1 commerce line) + </w:t>
+      </w:r>
+      <w:r>
+        <w:rPr>
+          <w:b/>
+        </w:rPr>
+        <w:t>turnkey service/production fees</w:t>
+      </w:r>
+      <w:r>
+        <w:t xml:space="preserve"> from enterprise partners + </w:t>
+      </w:r>
+      <w:r>
+        <w:rPr>
+          <w:b/>
+        </w:rPr>
+        <w:t>event sponsorship</w:t>
+      </w:r>
+      <w:r>
+        <w:t xml:space="preserve">; capital-light (creator/UGC + existing events). Consistent with the no-CPM principle — this is organic content + commerce, not commodity ad inventory. *(Paid social may still be used for subscriber </w:t>
+      </w:r>
+      <w:r>
+        <w:rPr>
+          <w:b/>
+        </w:rPr>
+        <w:t>acquisition</w:t>
+      </w:r>
+      <w:r>
+        <w:t>, per §9; that is buying reach to grow owned audience, distinct from selling CPM in our product.)*</w:t>
+      </w:r>
+    </w:p>
+    <w:p>
+      <w:r>
+        <w:rPr>
+          <w:b/>
+        </w:rPr>
+        <w:t>Risks &amp; guardrails.</w:t>
+      </w:r>
+      <w:r>
+        <w:t xml:space="preserve"> Algorithm volatility and </w:t>
+      </w:r>
+      <w:r>
+        <w:rPr>
+          <w:b/>
+        </w:rPr>
+        <w:t>US TikTok regulatory/ownership uncertainty</w:t>
+      </w:r>
+      <w:r>
+        <w:t xml:space="preserve"> — mitigate by (a) always converting social audiences to </w:t>
+      </w:r>
+      <w:r>
+        <w:rPr>
+          <w:b/>
+        </w:rPr>
+        <w:t>owned</w:t>
+      </w:r>
+      <w:r>
+        <w:t xml:space="preserve"> channels, (b) staying </w:t>
+      </w:r>
+      <w:r>
+        <w:rPr>
+          <w:b/>
+        </w:rPr>
+        <w:t>multi-platform</w:t>
+      </w:r>
+      <w:r>
+        <w:t xml:space="preserve"> (IG Shopping / YouTube / TikTok), and (c) treating live-selling commerce as </w:t>
+      </w:r>
+      <w:r>
+        <w:rPr>
+          <w:b/>
+        </w:rPr>
+        <w:t>incremental upside, not a core dependency.</w:t>
+      </w:r>
+      <w:r>
+        <w:t xml:space="preserve"> Maintain brand safety and FTC disclosure on creator content.</w:t>
+      </w:r>
+    </w:p>
+    <w:p>
       <w:r>
         <w:br/>
       </w:r>
@@ -16031,6 +16343,45 @@
                 <w:sz w:val="20"/>
               </w:rPr>
               <w:t>Own email/SMS/app/IRL relationships; diversify channels</w:t>
+            </w:r>
+          </w:p>
+        </w:tc>
+      </w:tr>
+      <w:tr>
+        <w:tc>
+          <w:tcPr>
+            <w:tcW w:type="dxa" w:w="4320"/>
+          </w:tcPr>
+          <w:p>
+            <w:r>
+              <w:rPr>
+                <w:sz w:val="20"/>
+              </w:rPr>
+            </w:r>
+            <w:r>
+              <w:rPr>
+                <w:b/>
+                <w:sz w:val="20"/>
+              </w:rPr>
+              <w:t>Social-platform dependency / TikTok regulatory risk</w:t>
+            </w:r>
+          </w:p>
+        </w:tc>
+        <w:tc>
+          <w:tcPr>
+            <w:tcW w:type="dxa" w:w="4320"/>
+          </w:tcPr>
+          <w:p>
+            <w:r>
+              <w:rPr>
+                <w:sz w:val="20"/>
+              </w:rPr>
+            </w:r>
+            <w:r>
+              <w:rPr>
+                <w:sz w:val="20"/>
+              </w:rPr>
+              <w:t>Convert social audiences to owned channels; run multi-platform (IG/YouTube/TikTok); treat live-selling commerce as incremental upside, not core</w:t>
             </w:r>
           </w:p>
         </w:tc>

</xml_diff>

<commit_message>
Recalibrate CityDog as a weak, low-threat incumbent (no moat to follow)
Per direction: CityDog has no real market power. Reframe from 'entrenched
threat' to 'weak/low-threat incumbent that validates the category but cannot
defend it' - no first-party data, no community/loyalty, no national member-brand
demand, no mission/credibility; locked into an ad-model + major-metro cost base,
so it structurally can't follow into right-size markets or rebuild fast enough
once PoC reaches regional scale. Real watch-list = the well-funded national
players. Updated business-plan SWOT/threats, risk row, and S5.1 ('why it can't
respond'), and the Competitive Analysis SWOT. Regenerated Word export.

Co-Authored-By: Claude Opus 4.8 (1M context) <noreply@anthropic.com>
Claude-Session: https://claude.ai/code/session_016gWMtWeutWcnpqhZxT7WHC
</commit_message>
<xml_diff>
--- a/PoC-Business-Plan.docx
+++ b/PoC-Business-Plan.docx
@@ -1940,7 +1940,43 @@
         <w:t>largely non-overlapping</w:t>
       </w:r>
       <w:r>
-        <w:t xml:space="preserve"> with its major-metro map; where it overlaps (e.g., Austin), we win on local depth, UX, and the utility/data layers.</w:t>
+        <w:t xml:space="preserve"> with its major-metro map; where it overlaps (e.g., Austin), we win on local depth, UX, and the utility/data layers. </w:t>
+      </w:r>
+      <w:r>
+        <w:rPr>
+          <w:b/>
+        </w:rPr>
+        <w:t>Why it can't respond (no market power):</w:t>
+      </w:r>
+      <w:r>
+        <w:t xml:space="preserve"> despite the head start, CityDog has </w:t>
+      </w:r>
+      <w:r>
+        <w:rPr>
+          <w:b/>
+        </w:rPr>
+        <w:t>no defensible moat</w:t>
+      </w:r>
+      <w:r>
+        <w:t xml:space="preserve"> — no first-party data/panel, no community/loyalty layer, no national member-brand demand, no mission/credibility — and it's locked into an </w:t>
+      </w:r>
+      <w:r>
+        <w:rPr>
+          <w:b/>
+        </w:rPr>
+        <w:t>ad-model + major-metro cost base.</w:t>
+      </w:r>
+      <w:r>
+        <w:t xml:space="preserve"> To match us it would have to rebuild its product, give up its ad revenue, and enter right-size markets that don't fit its model. </w:t>
+      </w:r>
+      <w:r>
+        <w:rPr>
+          <w:b/>
+        </w:rPr>
+        <w:t>By the time PoC reaches regional scale, the incumbent structurally cannot follow</w:t>
+      </w:r>
+      <w:r>
+        <w:t xml:space="preserve"> — it *validates* the category, it doesn't defend it. The real competitive watch-list is the well-funded national players, not CityDog.</w:t>
       </w:r>
     </w:p>
     <w:p>
@@ -2911,25 +2947,22 @@
         <w:pStyle w:val="ListBullet"/>
       </w:pPr>
       <w:r>
-        <w:t xml:space="preserve">An </w:t>
-      </w:r>
-      <w:r>
         <w:rPr>
           <w:b/>
         </w:rPr>
-        <w:t>entrenched 20-year incumbent</w:t>
-      </w:r>
-      <w:r>
-        <w:t xml:space="preserve"> (CityDog, ~20 digital metros) that could defend or move down-market; </w:t>
+        <w:t>Well-funded national players</w:t>
+      </w:r>
+      <w:r>
+        <w:t xml:space="preserve"> (Mars/Kinship, Chewy, Rover, and 6AM adding a pet vertical) — the only competitors with real market power *(the 20-year incumbent CityDog is a </w:t>
       </w:r>
       <w:r>
         <w:rPr>
           <w:b/>
         </w:rPr>
-        <w:t>well-funded national players</w:t>
-      </w:r>
-      <w:r>
-        <w:t xml:space="preserve"> (Mars/Kinship, Chewy, Rover, and 6AM adding a pet vertical); </w:t>
+        <w:t>weak, low threat</w:t>
+      </w:r>
+      <w:r>
+        <w:t xml:space="preserve"> — no data/community/member-brand moat to respond with; see §5.1)*; </w:t>
       </w:r>
       <w:r>
         <w:rPr>
@@ -16105,13 +16138,13 @@
                 <w:b/>
                 <w:sz w:val="20"/>
               </w:rPr>
-              <w:t>Entrenched incumbent</w:t>
-            </w:r>
-            <w:r>
-              <w:rPr>
-                <w:sz w:val="20"/>
-              </w:rPr>
-              <w:t xml:space="preserve"> (CityDog, ~20 metros, 20+ yrs)</w:t>
+              <w:t>Incumbent</w:t>
+            </w:r>
+            <w:r>
+              <w:rPr>
+                <w:sz w:val="20"/>
+              </w:rPr>
+              <w:t xml:space="preserve"> (CityDog) — *weak / low threat*</w:t>
             </w:r>
           </w:p>
         </w:tc>
@@ -16129,7 +16162,7 @@
               <w:rPr>
                 <w:sz w:val="20"/>
               </w:rPr>
-              <w:t>Compete on model (community/data/UX, endemic/no-CPM) + market (right-size metros it ignores); footprint largely non-overlapping</w:t>
+              <w:t>No data/community/member-brand moat to respond with; ad-model + major-metro cost base; can't follow into right-size markets. Validates the category; doesn't defend it</w:t>
             </w:r>
           </w:p>
         </w:tc>

</xml_diff>